<commit_message>
feat: modulo de registro y verificacion avanzado
</commit_message>
<xml_diff>
--- a/psp0-calidad-procesos/modulo-1/Formato - Casos de Prueba.docx
+++ b/psp0-calidad-procesos/modulo-1/Formato - Casos de Prueba.docx
@@ -1,6 +1,6 @@
 
 <file path=word/document.xml><?xml version="1.0" encoding="utf-8"?>
-<w:document xmlns:ve="http://schemas.openxmlformats.org/markup-compatibility/2006" xmlns:o="urn:schemas-microsoft-com:office:office" xmlns:r="http://schemas.openxmlformats.org/officeDocument/2006/relationships" xmlns:m="http://schemas.openxmlformats.org/officeDocument/2006/math" xmlns:v="urn:schemas-microsoft-com:vml" xmlns:wp="http://schemas.openxmlformats.org/drawingml/2006/wordprocessingDrawing" xmlns:w10="urn:schemas-microsoft-com:office:word" xmlns:w="http://schemas.openxmlformats.org/wordprocessingml/2006/main" xmlns:wne="http://schemas.microsoft.com/office/word/2006/wordml">
+<w:document xmlns:wpc="http://schemas.microsoft.com/office/word/2010/wordprocessingCanvas" xmlns:cx="http://schemas.microsoft.com/office/drawing/2014/chartex" xmlns:cx1="http://schemas.microsoft.com/office/drawing/2015/9/8/chartex" xmlns:cx2="http://schemas.microsoft.com/office/drawing/2015/10/21/chartex" xmlns:cx3="http://schemas.microsoft.com/office/drawing/2016/5/9/chartex" xmlns:cx4="http://schemas.microsoft.com/office/drawing/2016/5/10/chartex" xmlns:cx5="http://schemas.microsoft.com/office/drawing/2016/5/11/chartex" xmlns:cx6="http://schemas.microsoft.com/office/drawing/2016/5/12/chartex" xmlns:cx7="http://schemas.microsoft.com/office/drawing/2016/5/13/chartex" xmlns:cx8="http://schemas.microsoft.com/office/drawing/2016/5/14/chartex" xmlns:mc="http://schemas.openxmlformats.org/markup-compatibility/2006" xmlns:aink="http://schemas.microsoft.com/office/drawing/2016/ink" xmlns:am3d="http://schemas.microsoft.com/office/drawing/2017/model3d" xmlns:o="urn:schemas-microsoft-com:office:office" xmlns:oel="http://schemas.microsoft.com/office/2019/extlst" xmlns:r="http://schemas.openxmlformats.org/officeDocument/2006/relationships" xmlns:m="http://schemas.openxmlformats.org/officeDocument/2006/math" xmlns:v="urn:schemas-microsoft-com:vml" xmlns:wp14="http://schemas.microsoft.com/office/word/2010/wordprocessingDrawing" xmlns:wp="http://schemas.openxmlformats.org/drawingml/2006/wordprocessingDrawing" xmlns:w10="urn:schemas-microsoft-com:office:word" xmlns:w="http://schemas.openxmlformats.org/wordprocessingml/2006/main" xmlns:w14="http://schemas.microsoft.com/office/word/2010/wordml" xmlns:w15="http://schemas.microsoft.com/office/word/2012/wordml" xmlns:w16cex="http://schemas.microsoft.com/office/word/2018/wordml/cex" xmlns:w16cid="http://schemas.microsoft.com/office/word/2016/wordml/cid" xmlns:w16="http://schemas.microsoft.com/office/word/2018/wordml" xmlns:w16du="http://schemas.microsoft.com/office/word/2023/wordml/word16du" xmlns:w16sdtdh="http://schemas.microsoft.com/office/word/2020/wordml/sdtdatahash" xmlns:w16sdtfl="http://schemas.microsoft.com/office/word/2024/wordml/sdtformatlock" xmlns:w16se="http://schemas.microsoft.com/office/word/2015/wordml/symex" xmlns:wpg="http://schemas.microsoft.com/office/word/2010/wordprocessingGroup" xmlns:wpi="http://schemas.microsoft.com/office/word/2010/wordprocessingInk" xmlns:wne="http://schemas.microsoft.com/office/word/2006/wordml" xmlns:wps="http://schemas.microsoft.com/office/word/2010/wordprocessingShape" mc:Ignorable="w14 w15 w16se w16cid w16 w16cex w16sdtdh w16sdtfl w16du wp14">
   <w:body>
     <w:p>
       <w:pPr>
@@ -34,7 +34,7 @@
       <w:tblPr>
         <w:tblStyle w:val="Tablaconcuadrcula"/>
         <w:tblW w:w="14737" w:type="dxa"/>
-        <w:tblLook w:val="04A0"/>
+        <w:tblLook w:val="04A0" w:firstRow="1" w:lastRow="0" w:firstColumn="1" w:lastColumn="0" w:noHBand="0" w:noVBand="1"/>
       </w:tblPr>
       <w:tblGrid>
         <w:gridCol w:w="1185"/>
@@ -74,10 +74,7 @@
               <w:pStyle w:val="Sinespaciado"/>
             </w:pPr>
             <w:r>
-              <w:t>IP-</w:t>
-            </w:r>
-            <w:r>
-              <w:t>DDMMAAAA</w:t>
+              <w:t>23-003-1725</w:t>
             </w:r>
           </w:p>
         </w:tc>
@@ -124,25 +121,21 @@
             <w:pPr>
               <w:pStyle w:val="Sinespaciado"/>
             </w:pPr>
-            <w:proofErr w:type="spellStart"/>
-            <w:r>
-              <w:t>dd</w:t>
-            </w:r>
-            <w:proofErr w:type="spellEnd"/>
+            <w:r>
+              <w:t>20</w:t>
+            </w:r>
             <w:r>
               <w:t>/</w:t>
             </w:r>
             <w:r>
-              <w:t>mm</w:t>
+              <w:t>09</w:t>
             </w:r>
             <w:r>
               <w:t>/</w:t>
             </w:r>
-            <w:proofErr w:type="spellStart"/>
-            <w:r>
-              <w:t>aaaa</w:t>
-            </w:r>
-            <w:proofErr w:type="spellEnd"/>
+            <w:r>
+              <w:t>2026</w:t>
+            </w:r>
           </w:p>
         </w:tc>
       </w:tr>
@@ -177,8 +170,13 @@
               <w:pStyle w:val="Sinespaciado"/>
             </w:pPr>
             <w:r>
-              <w:t>Nombre del Programador</w:t>
-            </w:r>
+              <w:t xml:space="preserve">Ortiz Pérez Miguel </w:t>
+            </w:r>
+            <w:proofErr w:type="spellStart"/>
+            <w:r>
+              <w:t>Angel</w:t>
+            </w:r>
+            <w:proofErr w:type="spellEnd"/>
           </w:p>
         </w:tc>
         <w:tc>
@@ -225,10 +223,7 @@
               <w:pStyle w:val="Sinespaciado"/>
             </w:pPr>
             <w:r>
-              <w:t>N</w:t>
-            </w:r>
-            <w:r>
-              <w:t>úmero</w:t>
+              <w:t>Modulo-1</w:t>
             </w:r>
           </w:p>
         </w:tc>
@@ -266,7 +261,7 @@
           <w:left w:w="28" w:type="dxa"/>
           <w:right w:w="28" w:type="dxa"/>
         </w:tblCellMar>
-        <w:tblLook w:val="04A0"/>
+        <w:tblLook w:val="04A0" w:firstRow="1" w:lastRow="0" w:firstColumn="1" w:lastColumn="0" w:noHBand="0" w:noVBand="1"/>
       </w:tblPr>
       <w:tblGrid>
         <w:gridCol w:w="227"/>
@@ -490,6 +485,13 @@
                 <w:szCs w:val="16"/>
               </w:rPr>
             </w:pPr>
+            <w:r>
+              <w:rPr>
+                <w:sz w:val="16"/>
+                <w:szCs w:val="16"/>
+              </w:rPr>
+              <w:t>Iniciar sesión</w:t>
+            </w:r>
           </w:p>
         </w:tc>
         <w:tc>
@@ -504,6 +506,20 @@
                 <w:szCs w:val="16"/>
               </w:rPr>
             </w:pPr>
+            <w:r>
+              <w:rPr>
+                <w:sz w:val="16"/>
+                <w:szCs w:val="16"/>
+              </w:rPr>
+              <w:t xml:space="preserve">Para esto debemos ingresar un usuario valido </w:t>
+            </w:r>
+            <w:r>
+              <w:rPr>
+                <w:sz w:val="16"/>
+                <w:szCs w:val="16"/>
+              </w:rPr>
+              <w:t>y la contraseña que le corresponde</w:t>
+            </w:r>
           </w:p>
         </w:tc>
         <w:tc>
@@ -519,101 +535,14 @@
                 <w:szCs w:val="14"/>
               </w:rPr>
             </w:pPr>
-          </w:p>
-        </w:tc>
-        <w:tc>
-          <w:tcPr>
-            <w:tcW w:w="5029" w:type="dxa"/>
-          </w:tcPr>
-          <w:p>
-            <w:pPr>
-              <w:pStyle w:val="Sinespaciado"/>
-              <w:rPr>
-                <w:sz w:val="16"/>
-                <w:szCs w:val="16"/>
-              </w:rPr>
-            </w:pPr>
-          </w:p>
-        </w:tc>
-        <w:tc>
-          <w:tcPr>
-            <w:tcW w:w="2268" w:type="dxa"/>
-          </w:tcPr>
-          <w:p>
-            <w:pPr>
-              <w:pStyle w:val="Sinespaciado"/>
-              <w:rPr>
-                <w:sz w:val="16"/>
-                <w:szCs w:val="16"/>
-              </w:rPr>
-            </w:pPr>
-          </w:p>
-        </w:tc>
-      </w:tr>
-      <w:tr>
-        <w:tc>
-          <w:tcPr>
-            <w:tcW w:w="227" w:type="dxa"/>
-          </w:tcPr>
-          <w:p>
-            <w:pPr>
-              <w:pStyle w:val="Sinespaciado"/>
-              <w:jc w:val="center"/>
-              <w:rPr>
-                <w:sz w:val="16"/>
-                <w:szCs w:val="16"/>
-              </w:rPr>
-            </w:pPr>
-            <w:r>
-              <w:rPr>
-                <w:sz w:val="16"/>
-                <w:szCs w:val="16"/>
-              </w:rPr>
-              <w:t>2</w:t>
-            </w:r>
-          </w:p>
-        </w:tc>
-        <w:tc>
-          <w:tcPr>
-            <w:tcW w:w="1247" w:type="dxa"/>
-          </w:tcPr>
-          <w:p>
-            <w:pPr>
-              <w:pStyle w:val="Sinespaciado"/>
-              <w:rPr>
-                <w:sz w:val="16"/>
-                <w:szCs w:val="16"/>
-              </w:rPr>
-            </w:pPr>
-          </w:p>
-        </w:tc>
-        <w:tc>
-          <w:tcPr>
-            <w:tcW w:w="1701" w:type="dxa"/>
-          </w:tcPr>
-          <w:p>
-            <w:pPr>
-              <w:pStyle w:val="Sinespaciado"/>
-              <w:rPr>
-                <w:sz w:val="16"/>
-                <w:szCs w:val="16"/>
-              </w:rPr>
-            </w:pPr>
-          </w:p>
-        </w:tc>
-        <w:tc>
-          <w:tcPr>
-            <w:tcW w:w="4649" w:type="dxa"/>
-          </w:tcPr>
-          <w:p>
-            <w:pPr>
-              <w:pStyle w:val="Sinespaciado"/>
+            <w:r>
               <w:rPr>
                 <w:rFonts w:ascii="Courier New" w:hAnsi="Courier New" w:cs="Courier New"/>
                 <w:sz w:val="14"/>
                 <w:szCs w:val="14"/>
               </w:rPr>
-            </w:pPr>
+              <w:t>Nos permite acceder a su ventana que le corresponde según el nivel de acceso</w:t>
+            </w:r>
           </w:p>
         </w:tc>
         <w:tc>
@@ -628,6 +557,47 @@
                 <w:szCs w:val="16"/>
               </w:rPr>
             </w:pPr>
+            <w:r>
+              <w:rPr>
+                <w:sz w:val="16"/>
+                <w:szCs w:val="16"/>
+              </w:rPr>
+              <w:drawing>
+                <wp:inline distT="0" distB="0" distL="0" distR="0" wp14:anchorId="4E1FD5FC" wp14:editId="366103C8">
+                  <wp:extent cx="3157855" cy="2520315"/>
+                  <wp:effectExtent l="0" t="0" r="4445" b="0"/>
+                  <wp:docPr id="280693201" name="Imagen 1"/>
+                  <wp:cNvGraphicFramePr>
+                    <a:graphicFrameLocks xmlns:a="http://schemas.openxmlformats.org/drawingml/2006/main" noChangeAspect="1"/>
+                  </wp:cNvGraphicFramePr>
+                  <a:graphic xmlns:a="http://schemas.openxmlformats.org/drawingml/2006/main">
+                    <a:graphicData uri="http://schemas.openxmlformats.org/drawingml/2006/picture">
+                      <pic:pic xmlns:pic="http://schemas.openxmlformats.org/drawingml/2006/picture">
+                        <pic:nvPicPr>
+                          <pic:cNvPr id="280693201" name=""/>
+                          <pic:cNvPicPr/>
+                        </pic:nvPicPr>
+                        <pic:blipFill>
+                          <a:blip r:embed="rId5"/>
+                          <a:stretch>
+                            <a:fillRect/>
+                          </a:stretch>
+                        </pic:blipFill>
+                        <pic:spPr>
+                          <a:xfrm>
+                            <a:off x="0" y="0"/>
+                            <a:ext cx="3157855" cy="2520315"/>
+                          </a:xfrm>
+                          <a:prstGeom prst="rect">
+                            <a:avLst/>
+                          </a:prstGeom>
+                        </pic:spPr>
+                      </pic:pic>
+                    </a:graphicData>
+                  </a:graphic>
+                </wp:inline>
+              </w:drawing>
+            </w:r>
           </w:p>
         </w:tc>
         <w:tc>
@@ -642,6 +612,13 @@
                 <w:szCs w:val="16"/>
               </w:rPr>
             </w:pPr>
+            <w:r>
+              <w:rPr>
+                <w:sz w:val="16"/>
+                <w:szCs w:val="16"/>
+              </w:rPr>
+              <w:t>Esperábamos que esta parte funcionara tal cual, ya que el inicio de sesión permite el acceso al flujo principal.</w:t>
+            </w:r>
           </w:p>
         </w:tc>
       </w:tr>
@@ -664,7 +641,7 @@
                 <w:sz w:val="16"/>
                 <w:szCs w:val="16"/>
               </w:rPr>
-              <w:t>3</w:t>
+              <w:t>2</w:t>
             </w:r>
           </w:p>
         </w:tc>
@@ -680,6 +657,13 @@
                 <w:szCs w:val="16"/>
               </w:rPr>
             </w:pPr>
+            <w:r>
+              <w:rPr>
+                <w:sz w:val="16"/>
+                <w:szCs w:val="16"/>
+              </w:rPr>
+              <w:t xml:space="preserve">Registro de usuario </w:t>
+            </w:r>
           </w:p>
         </w:tc>
         <w:tc>
@@ -694,6 +678,13 @@
                 <w:szCs w:val="16"/>
               </w:rPr>
             </w:pPr>
+            <w:r>
+              <w:rPr>
+                <w:sz w:val="16"/>
+                <w:szCs w:val="16"/>
+              </w:rPr>
+              <w:t xml:space="preserve">Para esto debemos llenar los campos mostrados en el formulario </w:t>
+            </w:r>
           </w:p>
         </w:tc>
         <w:tc>
@@ -709,93 +700,14 @@
                 <w:szCs w:val="14"/>
               </w:rPr>
             </w:pPr>
-          </w:p>
-        </w:tc>
-        <w:tc>
-          <w:tcPr>
-            <w:tcW w:w="5029" w:type="dxa"/>
-          </w:tcPr>
-          <w:p>
-            <w:pPr>
-              <w:pStyle w:val="Sinespaciado"/>
-              <w:rPr>
-                <w:sz w:val="16"/>
-                <w:szCs w:val="16"/>
-              </w:rPr>
-            </w:pPr>
-          </w:p>
-        </w:tc>
-        <w:tc>
-          <w:tcPr>
-            <w:tcW w:w="2268" w:type="dxa"/>
-          </w:tcPr>
-          <w:p/>
-        </w:tc>
-      </w:tr>
-      <w:tr>
-        <w:tc>
-          <w:tcPr>
-            <w:tcW w:w="227" w:type="dxa"/>
-          </w:tcPr>
-          <w:p>
-            <w:pPr>
-              <w:pStyle w:val="Sinespaciado"/>
-              <w:jc w:val="center"/>
-              <w:rPr>
-                <w:sz w:val="16"/>
-                <w:szCs w:val="16"/>
-              </w:rPr>
-            </w:pPr>
-            <w:r>
-              <w:rPr>
-                <w:sz w:val="16"/>
-                <w:szCs w:val="16"/>
-              </w:rPr>
-              <w:t>4</w:t>
-            </w:r>
-          </w:p>
-        </w:tc>
-        <w:tc>
-          <w:tcPr>
-            <w:tcW w:w="1247" w:type="dxa"/>
-          </w:tcPr>
-          <w:p>
-            <w:pPr>
-              <w:pStyle w:val="Sinespaciado"/>
-              <w:rPr>
-                <w:sz w:val="16"/>
-                <w:szCs w:val="16"/>
-              </w:rPr>
-            </w:pPr>
-          </w:p>
-        </w:tc>
-        <w:tc>
-          <w:tcPr>
-            <w:tcW w:w="1701" w:type="dxa"/>
-          </w:tcPr>
-          <w:p>
-            <w:pPr>
-              <w:pStyle w:val="Sinespaciado"/>
-              <w:rPr>
-                <w:sz w:val="16"/>
-                <w:szCs w:val="16"/>
-              </w:rPr>
-            </w:pPr>
-          </w:p>
-        </w:tc>
-        <w:tc>
-          <w:tcPr>
-            <w:tcW w:w="4649" w:type="dxa"/>
-          </w:tcPr>
-          <w:p>
-            <w:pPr>
-              <w:pStyle w:val="Sinespaciado"/>
+            <w:r>
               <w:rPr>
                 <w:rFonts w:ascii="Courier New" w:hAnsi="Courier New" w:cs="Courier New"/>
                 <w:sz w:val="14"/>
                 <w:szCs w:val="14"/>
               </w:rPr>
-            </w:pPr>
+              <w:t>Debe permitir el registro de manera adecuada, en esta iteración no esperamos registrar, ya que aun falta trabajar en el logaritmo que hará que este flujo tenga mayor robustes y consistencia con lo planteado previamente</w:t>
+            </w:r>
           </w:p>
         </w:tc>
         <w:tc>
@@ -810,6 +722,47 @@
                 <w:szCs w:val="16"/>
               </w:rPr>
             </w:pPr>
+            <w:r>
+              <w:rPr>
+                <w:sz w:val="16"/>
+                <w:szCs w:val="16"/>
+              </w:rPr>
+              <w:drawing>
+                <wp:inline distT="0" distB="0" distL="0" distR="0" wp14:anchorId="055B4324" wp14:editId="593C21E5">
+                  <wp:extent cx="3000375" cy="2660699"/>
+                  <wp:effectExtent l="0" t="0" r="0" b="0"/>
+                  <wp:docPr id="1939699550" name="Imagen 1"/>
+                  <wp:cNvGraphicFramePr>
+                    <a:graphicFrameLocks xmlns:a="http://schemas.openxmlformats.org/drawingml/2006/main" noChangeAspect="1"/>
+                  </wp:cNvGraphicFramePr>
+                  <a:graphic xmlns:a="http://schemas.openxmlformats.org/drawingml/2006/main">
+                    <a:graphicData uri="http://schemas.openxmlformats.org/drawingml/2006/picture">
+                      <pic:pic xmlns:pic="http://schemas.openxmlformats.org/drawingml/2006/picture">
+                        <pic:nvPicPr>
+                          <pic:cNvPr id="1939699550" name=""/>
+                          <pic:cNvPicPr/>
+                        </pic:nvPicPr>
+                        <pic:blipFill>
+                          <a:blip r:embed="rId6"/>
+                          <a:stretch>
+                            <a:fillRect/>
+                          </a:stretch>
+                        </pic:blipFill>
+                        <pic:spPr>
+                          <a:xfrm>
+                            <a:off x="0" y="0"/>
+                            <a:ext cx="3028263" cy="2685429"/>
+                          </a:xfrm>
+                          <a:prstGeom prst="rect">
+                            <a:avLst/>
+                          </a:prstGeom>
+                        </pic:spPr>
+                      </pic:pic>
+                    </a:graphicData>
+                  </a:graphic>
+                </wp:inline>
+              </w:drawing>
+            </w:r>
           </w:p>
         </w:tc>
         <w:tc>
@@ -824,6 +777,13 @@
                 <w:szCs w:val="16"/>
               </w:rPr>
             </w:pPr>
+            <w:r>
+              <w:rPr>
+                <w:sz w:val="16"/>
+                <w:szCs w:val="16"/>
+              </w:rPr>
+              <w:t>Esperábamos que nos mostrara el resumen del llenado del formulario, así como el apartado donde deberemos ingresar el código proporcionado, aunque este solo sea de manera simbólica ya que aun debemos modificar ciertas clases para echar a andar este apartado.</w:t>
+            </w:r>
           </w:p>
         </w:tc>
       </w:tr>
@@ -846,7 +806,8 @@
                 <w:sz w:val="16"/>
                 <w:szCs w:val="16"/>
               </w:rPr>
-              <w:t>5</w:t>
+              <w:lastRenderedPageBreak/>
+              <w:t>3</w:t>
             </w:r>
           </w:p>
         </w:tc>
@@ -862,6 +823,13 @@
                 <w:szCs w:val="16"/>
               </w:rPr>
             </w:pPr>
+            <w:r>
+              <w:rPr>
+                <w:sz w:val="16"/>
+                <w:szCs w:val="16"/>
+              </w:rPr>
+              <w:t>Registro de usuario</w:t>
+            </w:r>
           </w:p>
         </w:tc>
         <w:tc>
@@ -876,6 +844,13 @@
                 <w:szCs w:val="16"/>
               </w:rPr>
             </w:pPr>
+            <w:r>
+              <w:rPr>
+                <w:sz w:val="16"/>
+                <w:szCs w:val="16"/>
+              </w:rPr>
+              <w:t>Para esto debemos terminar el llenado del formulario y poder el administrador darnos acceso mediante su sistema o con un token generado por otro medio</w:t>
+            </w:r>
           </w:p>
         </w:tc>
         <w:tc>
@@ -891,6 +866,14 @@
                 <w:szCs w:val="14"/>
               </w:rPr>
             </w:pPr>
+            <w:r>
+              <w:rPr>
+                <w:rFonts w:ascii="Courier New" w:hAnsi="Courier New" w:cs="Courier New"/>
+                <w:sz w:val="14"/>
+                <w:szCs w:val="14"/>
+              </w:rPr>
+              <w:t>Poder validar el registro</w:t>
+            </w:r>
           </w:p>
         </w:tc>
         <w:tc>
@@ -905,6 +888,47 @@
                 <w:szCs w:val="16"/>
               </w:rPr>
             </w:pPr>
+            <w:r>
+              <w:rPr>
+                <w:sz w:val="16"/>
+                <w:szCs w:val="16"/>
+              </w:rPr>
+              <w:drawing>
+                <wp:inline distT="0" distB="0" distL="0" distR="0" wp14:anchorId="1C7F83D7" wp14:editId="62F1983C">
+                  <wp:extent cx="3157855" cy="2083435"/>
+                  <wp:effectExtent l="0" t="0" r="4445" b="0"/>
+                  <wp:docPr id="1503484343" name="Imagen 1"/>
+                  <wp:cNvGraphicFramePr>
+                    <a:graphicFrameLocks xmlns:a="http://schemas.openxmlformats.org/drawingml/2006/main" noChangeAspect="1"/>
+                  </wp:cNvGraphicFramePr>
+                  <a:graphic xmlns:a="http://schemas.openxmlformats.org/drawingml/2006/main">
+                    <a:graphicData uri="http://schemas.openxmlformats.org/drawingml/2006/picture">
+                      <pic:pic xmlns:pic="http://schemas.openxmlformats.org/drawingml/2006/picture">
+                        <pic:nvPicPr>
+                          <pic:cNvPr id="1503484343" name=""/>
+                          <pic:cNvPicPr/>
+                        </pic:nvPicPr>
+                        <pic:blipFill>
+                          <a:blip r:embed="rId7"/>
+                          <a:stretch>
+                            <a:fillRect/>
+                          </a:stretch>
+                        </pic:blipFill>
+                        <pic:spPr>
+                          <a:xfrm>
+                            <a:off x="0" y="0"/>
+                            <a:ext cx="3157855" cy="2083435"/>
+                          </a:xfrm>
+                          <a:prstGeom prst="rect">
+                            <a:avLst/>
+                          </a:prstGeom>
+                        </pic:spPr>
+                      </pic:pic>
+                    </a:graphicData>
+                  </a:graphic>
+                </wp:inline>
+              </w:drawing>
+            </w:r>
           </w:p>
         </w:tc>
         <w:tc>
@@ -913,12 +937,356 @@
           </w:tcPr>
           <w:p>
             <w:pPr>
-              <w:pStyle w:val="Sinespaciado"/>
-              <w:rPr>
-                <w:sz w:val="16"/>
-                <w:szCs w:val="16"/>
-              </w:rPr>
-            </w:pPr>
+              <w:rPr>
+                <w:sz w:val="16"/>
+                <w:szCs w:val="16"/>
+              </w:rPr>
+            </w:pPr>
+            <w:r>
+              <w:rPr>
+                <w:sz w:val="16"/>
+                <w:szCs w:val="16"/>
+              </w:rPr>
+              <w:t>El administrador aun no cuenta con esta pantalla, pero será agregada para cumplir con el análisis planteado</w:t>
+            </w:r>
+            <w:r>
+              <w:rPr>
+                <w:sz w:val="16"/>
+                <w:szCs w:val="16"/>
+              </w:rPr>
+              <w:t>.</w:t>
+            </w:r>
+          </w:p>
+        </w:tc>
+      </w:tr>
+      <w:tr>
+        <w:tc>
+          <w:tcPr>
+            <w:tcW w:w="227" w:type="dxa"/>
+          </w:tcPr>
+          <w:p>
+            <w:pPr>
+              <w:pStyle w:val="Sinespaciado"/>
+              <w:jc w:val="center"/>
+              <w:rPr>
+                <w:sz w:val="16"/>
+                <w:szCs w:val="16"/>
+              </w:rPr>
+            </w:pPr>
+            <w:r>
+              <w:rPr>
+                <w:sz w:val="16"/>
+                <w:szCs w:val="16"/>
+              </w:rPr>
+              <w:t>4</w:t>
+            </w:r>
+          </w:p>
+        </w:tc>
+        <w:tc>
+          <w:tcPr>
+            <w:tcW w:w="1247" w:type="dxa"/>
+          </w:tcPr>
+          <w:p>
+            <w:pPr>
+              <w:pStyle w:val="Sinespaciado"/>
+              <w:rPr>
+                <w:sz w:val="16"/>
+                <w:szCs w:val="16"/>
+              </w:rPr>
+            </w:pPr>
+            <w:r>
+              <w:rPr>
+                <w:sz w:val="16"/>
+                <w:szCs w:val="16"/>
+              </w:rPr>
+              <w:t>Poder entrar después de registrar a mi usuario</w:t>
+            </w:r>
+          </w:p>
+        </w:tc>
+        <w:tc>
+          <w:tcPr>
+            <w:tcW w:w="1701" w:type="dxa"/>
+          </w:tcPr>
+          <w:p>
+            <w:pPr>
+              <w:pStyle w:val="Sinespaciado"/>
+              <w:rPr>
+                <w:sz w:val="16"/>
+                <w:szCs w:val="16"/>
+              </w:rPr>
+            </w:pPr>
+            <w:r>
+              <w:rPr>
+                <w:sz w:val="16"/>
+                <w:szCs w:val="16"/>
+              </w:rPr>
+              <w:t>Para esto debemos recordar que después de registrarnos esperamos recibir un acceso al sistema</w:t>
+            </w:r>
+          </w:p>
+        </w:tc>
+        <w:tc>
+          <w:tcPr>
+            <w:tcW w:w="4649" w:type="dxa"/>
+          </w:tcPr>
+          <w:p>
+            <w:pPr>
+              <w:pStyle w:val="Sinespaciado"/>
+              <w:rPr>
+                <w:rFonts w:ascii="Courier New" w:hAnsi="Courier New" w:cs="Courier New"/>
+                <w:sz w:val="14"/>
+                <w:szCs w:val="14"/>
+              </w:rPr>
+            </w:pPr>
+            <w:r>
+              <w:rPr>
+                <w:rFonts w:ascii="Courier New" w:hAnsi="Courier New" w:cs="Courier New"/>
+                <w:sz w:val="14"/>
+                <w:szCs w:val="14"/>
+              </w:rPr>
+              <w:t>Poder entrar con nuestra contraseña y usuario agregado</w:t>
+            </w:r>
+          </w:p>
+        </w:tc>
+        <w:tc>
+          <w:tcPr>
+            <w:tcW w:w="5029" w:type="dxa"/>
+          </w:tcPr>
+          <w:p>
+            <w:pPr>
+              <w:pStyle w:val="Sinespaciado"/>
+              <w:rPr>
+                <w:sz w:val="16"/>
+                <w:szCs w:val="16"/>
+              </w:rPr>
+            </w:pPr>
+            <w:r>
+              <w:rPr>
+                <w:sz w:val="16"/>
+                <w:szCs w:val="16"/>
+              </w:rPr>
+              <w:drawing>
+                <wp:inline distT="0" distB="0" distL="0" distR="0" wp14:anchorId="7AF39749" wp14:editId="6DFFBAC9">
+                  <wp:extent cx="3157855" cy="2540635"/>
+                  <wp:effectExtent l="0" t="0" r="4445" b="0"/>
+                  <wp:docPr id="1370407067" name="Imagen 1"/>
+                  <wp:cNvGraphicFramePr>
+                    <a:graphicFrameLocks xmlns:a="http://schemas.openxmlformats.org/drawingml/2006/main" noChangeAspect="1"/>
+                  </wp:cNvGraphicFramePr>
+                  <a:graphic xmlns:a="http://schemas.openxmlformats.org/drawingml/2006/main">
+                    <a:graphicData uri="http://schemas.openxmlformats.org/drawingml/2006/picture">
+                      <pic:pic xmlns:pic="http://schemas.openxmlformats.org/drawingml/2006/picture">
+                        <pic:nvPicPr>
+                          <pic:cNvPr id="1370407067" name=""/>
+                          <pic:cNvPicPr/>
+                        </pic:nvPicPr>
+                        <pic:blipFill>
+                          <a:blip r:embed="rId8"/>
+                          <a:stretch>
+                            <a:fillRect/>
+                          </a:stretch>
+                        </pic:blipFill>
+                        <pic:spPr>
+                          <a:xfrm>
+                            <a:off x="0" y="0"/>
+                            <a:ext cx="3157855" cy="2540635"/>
+                          </a:xfrm>
+                          <a:prstGeom prst="rect">
+                            <a:avLst/>
+                          </a:prstGeom>
+                        </pic:spPr>
+                      </pic:pic>
+                    </a:graphicData>
+                  </a:graphic>
+                </wp:inline>
+              </w:drawing>
+            </w:r>
+          </w:p>
+        </w:tc>
+        <w:tc>
+          <w:tcPr>
+            <w:tcW w:w="2268" w:type="dxa"/>
+          </w:tcPr>
+          <w:p>
+            <w:pPr>
+              <w:pStyle w:val="Sinespaciado"/>
+              <w:rPr>
+                <w:sz w:val="16"/>
+                <w:szCs w:val="16"/>
+              </w:rPr>
+            </w:pPr>
+            <w:r>
+              <w:rPr>
+                <w:sz w:val="16"/>
+                <w:szCs w:val="16"/>
+              </w:rPr>
+              <w:t>En esta ocasión no nos es posible, ya que trabajar de esta manera el flujo, ya que falta agregar y comunicar ciertos puntos para lograr esto, por el momento solo contamos con el acceso vía base del sistema incluida en NetBeans de manera manual</w:t>
+            </w:r>
+          </w:p>
+        </w:tc>
+      </w:tr>
+      <w:tr>
+        <w:tc>
+          <w:tcPr>
+            <w:tcW w:w="227" w:type="dxa"/>
+          </w:tcPr>
+          <w:p>
+            <w:pPr>
+              <w:pStyle w:val="Sinespaciado"/>
+              <w:jc w:val="center"/>
+              <w:rPr>
+                <w:sz w:val="16"/>
+                <w:szCs w:val="16"/>
+              </w:rPr>
+            </w:pPr>
+            <w:r>
+              <w:rPr>
+                <w:sz w:val="16"/>
+                <w:szCs w:val="16"/>
+              </w:rPr>
+              <w:lastRenderedPageBreak/>
+              <w:t>5</w:t>
+            </w:r>
+          </w:p>
+        </w:tc>
+        <w:tc>
+          <w:tcPr>
+            <w:tcW w:w="1247" w:type="dxa"/>
+          </w:tcPr>
+          <w:p>
+            <w:pPr>
+              <w:pStyle w:val="Sinespaciado"/>
+              <w:rPr>
+                <w:sz w:val="16"/>
+                <w:szCs w:val="16"/>
+              </w:rPr>
+            </w:pPr>
+            <w:r>
+              <w:rPr>
+                <w:sz w:val="16"/>
+                <w:szCs w:val="16"/>
+              </w:rPr>
+              <w:t>Regresar a la nueva venta de inicio de sesión</w:t>
+            </w:r>
+          </w:p>
+        </w:tc>
+        <w:tc>
+          <w:tcPr>
+            <w:tcW w:w="1701" w:type="dxa"/>
+          </w:tcPr>
+          <w:p>
+            <w:pPr>
+              <w:pStyle w:val="Sinespaciado"/>
+              <w:rPr>
+                <w:sz w:val="16"/>
+                <w:szCs w:val="16"/>
+              </w:rPr>
+            </w:pPr>
+            <w:r>
+              <w:rPr>
+                <w:sz w:val="16"/>
+                <w:szCs w:val="16"/>
+              </w:rPr>
+              <w:t>Para esto necesitamos entrar y presionar el botón de cerra sesión rojo abajo del todo en el menú</w:t>
+            </w:r>
+          </w:p>
+        </w:tc>
+        <w:tc>
+          <w:tcPr>
+            <w:tcW w:w="4649" w:type="dxa"/>
+          </w:tcPr>
+          <w:p>
+            <w:pPr>
+              <w:pStyle w:val="Sinespaciado"/>
+              <w:rPr>
+                <w:rFonts w:ascii="Courier New" w:hAnsi="Courier New" w:cs="Courier New"/>
+                <w:sz w:val="14"/>
+                <w:szCs w:val="14"/>
+              </w:rPr>
+            </w:pPr>
+            <w:r>
+              <w:rPr>
+                <w:rFonts w:ascii="Courier New" w:hAnsi="Courier New" w:cs="Courier New"/>
+                <w:sz w:val="14"/>
+                <w:szCs w:val="14"/>
+              </w:rPr>
+              <w:t>Poder regresar a la nueva ventana de inicio de sesión</w:t>
+            </w:r>
+          </w:p>
+        </w:tc>
+        <w:tc>
+          <w:tcPr>
+            <w:tcW w:w="5029" w:type="dxa"/>
+          </w:tcPr>
+          <w:p>
+            <w:pPr>
+              <w:pStyle w:val="Sinespaciado"/>
+              <w:rPr>
+                <w:sz w:val="16"/>
+                <w:szCs w:val="16"/>
+              </w:rPr>
+            </w:pPr>
+            <w:r>
+              <w:rPr>
+                <w:sz w:val="16"/>
+                <w:szCs w:val="16"/>
+              </w:rPr>
+              <w:drawing>
+                <wp:inline distT="0" distB="0" distL="0" distR="0" wp14:anchorId="344EC6B7" wp14:editId="4D2A22DC">
+                  <wp:extent cx="3157855" cy="2527300"/>
+                  <wp:effectExtent l="0" t="0" r="4445" b="6350"/>
+                  <wp:docPr id="1175648717" name="Imagen 1"/>
+                  <wp:cNvGraphicFramePr>
+                    <a:graphicFrameLocks xmlns:a="http://schemas.openxmlformats.org/drawingml/2006/main" noChangeAspect="1"/>
+                  </wp:cNvGraphicFramePr>
+                  <a:graphic xmlns:a="http://schemas.openxmlformats.org/drawingml/2006/main">
+                    <a:graphicData uri="http://schemas.openxmlformats.org/drawingml/2006/picture">
+                      <pic:pic xmlns:pic="http://schemas.openxmlformats.org/drawingml/2006/picture">
+                        <pic:nvPicPr>
+                          <pic:cNvPr id="1175648717" name=""/>
+                          <pic:cNvPicPr/>
+                        </pic:nvPicPr>
+                        <pic:blipFill>
+                          <a:blip r:embed="rId9"/>
+                          <a:stretch>
+                            <a:fillRect/>
+                          </a:stretch>
+                        </pic:blipFill>
+                        <pic:spPr>
+                          <a:xfrm>
+                            <a:off x="0" y="0"/>
+                            <a:ext cx="3157855" cy="2527300"/>
+                          </a:xfrm>
+                          <a:prstGeom prst="rect">
+                            <a:avLst/>
+                          </a:prstGeom>
+                        </pic:spPr>
+                      </pic:pic>
+                    </a:graphicData>
+                  </a:graphic>
+                </wp:inline>
+              </w:drawing>
+            </w:r>
+          </w:p>
+        </w:tc>
+        <w:tc>
+          <w:tcPr>
+            <w:tcW w:w="2268" w:type="dxa"/>
+          </w:tcPr>
+          <w:p>
+            <w:pPr>
+              <w:pStyle w:val="Sinespaciado"/>
+              <w:rPr>
+                <w:sz w:val="16"/>
+                <w:szCs w:val="16"/>
+              </w:rPr>
+            </w:pPr>
+            <w:r>
+              <w:rPr>
+                <w:sz w:val="16"/>
+                <w:szCs w:val="16"/>
+              </w:rPr>
+              <w:t>El retorno a login fue un éxito y probado en los dos menús distintos</w:t>
+            </w:r>
           </w:p>
         </w:tc>
       </w:tr>
@@ -1059,7 +1427,7 @@
           <w:left w:w="28" w:type="dxa"/>
           <w:right w:w="28" w:type="dxa"/>
         </w:tblCellMar>
-        <w:tblLook w:val="04A0"/>
+        <w:tblLook w:val="04A0" w:firstRow="1" w:lastRow="0" w:firstColumn="1" w:lastColumn="0" w:noHBand="0" w:noVBand="1"/>
       </w:tblPr>
       <w:tblGrid>
         <w:gridCol w:w="192"/>
@@ -1283,6 +1651,13 @@
                 <w:szCs w:val="16"/>
               </w:rPr>
             </w:pPr>
+            <w:r>
+              <w:rPr>
+                <w:sz w:val="16"/>
+                <w:szCs w:val="16"/>
+              </w:rPr>
+              <w:t>Inicio sesión (llaves inexistentes)</w:t>
+            </w:r>
           </w:p>
         </w:tc>
         <w:tc>
@@ -1297,6 +1672,13 @@
                 <w:szCs w:val="16"/>
               </w:rPr>
             </w:pPr>
+            <w:r>
+              <w:rPr>
+                <w:sz w:val="16"/>
+                <w:szCs w:val="16"/>
+              </w:rPr>
+              <w:t>Ingresamos datos erróneos para iniciar sesión e ingresamos un usuario correcto, con una llave incorrecta</w:t>
+            </w:r>
           </w:p>
         </w:tc>
         <w:tc>
@@ -1312,97 +1694,14 @@
                 <w:szCs w:val="14"/>
               </w:rPr>
             </w:pPr>
-          </w:p>
-        </w:tc>
-        <w:tc>
-          <w:tcPr>
-            <w:tcW w:w="7420" w:type="dxa"/>
-          </w:tcPr>
-          <w:p>
-            <w:pPr>
-              <w:pStyle w:val="Sinespaciado"/>
-            </w:pPr>
-          </w:p>
-        </w:tc>
-        <w:tc>
-          <w:tcPr>
-            <w:tcW w:w="1673" w:type="dxa"/>
-          </w:tcPr>
-          <w:p>
-            <w:pPr>
-              <w:pStyle w:val="Sinespaciado"/>
-              <w:rPr>
-                <w:sz w:val="16"/>
-                <w:szCs w:val="16"/>
-              </w:rPr>
-            </w:pPr>
-          </w:p>
-        </w:tc>
-      </w:tr>
-      <w:tr>
-        <w:tc>
-          <w:tcPr>
-            <w:tcW w:w="192" w:type="dxa"/>
-          </w:tcPr>
-          <w:p>
-            <w:pPr>
-              <w:pStyle w:val="Sinespaciado"/>
-              <w:jc w:val="center"/>
-              <w:rPr>
-                <w:sz w:val="16"/>
-                <w:szCs w:val="16"/>
-              </w:rPr>
-            </w:pPr>
-            <w:r>
-              <w:rPr>
-                <w:sz w:val="16"/>
-                <w:szCs w:val="16"/>
-              </w:rPr>
-              <w:t>2</w:t>
-            </w:r>
-          </w:p>
-        </w:tc>
-        <w:tc>
-          <w:tcPr>
-            <w:tcW w:w="1002" w:type="dxa"/>
-          </w:tcPr>
-          <w:p>
-            <w:pPr>
-              <w:pStyle w:val="Sinespaciado"/>
-              <w:rPr>
-                <w:sz w:val="16"/>
-                <w:szCs w:val="16"/>
-              </w:rPr>
-            </w:pPr>
-          </w:p>
-        </w:tc>
-        <w:tc>
-          <w:tcPr>
-            <w:tcW w:w="1408" w:type="dxa"/>
-          </w:tcPr>
-          <w:p>
-            <w:pPr>
-              <w:pStyle w:val="Sinespaciado"/>
-              <w:rPr>
-                <w:sz w:val="16"/>
-                <w:szCs w:val="16"/>
-              </w:rPr>
-            </w:pPr>
-          </w:p>
-        </w:tc>
-        <w:tc>
-          <w:tcPr>
-            <w:tcW w:w="3046" w:type="dxa"/>
-          </w:tcPr>
-          <w:p>
-            <w:pPr>
-              <w:pStyle w:val="Sinespaciado"/>
+            <w:r>
               <w:rPr>
                 <w:rFonts w:ascii="Courier New" w:hAnsi="Courier New" w:cs="Courier New"/>
                 <w:sz w:val="14"/>
                 <w:szCs w:val="14"/>
               </w:rPr>
-            </w:pPr>
+              <w:t>Nos niega el acceso con un mensaje</w:t>
+            </w:r>
           </w:p>
         </w:tc>
         <w:tc>
@@ -1413,6 +1712,43 @@
             <w:pPr>
               <w:pStyle w:val="Sinespaciado"/>
             </w:pPr>
+            <w:r>
+              <w:drawing>
+                <wp:inline distT="0" distB="0" distL="0" distR="0" wp14:anchorId="65156BFA" wp14:editId="54FD6D37">
+                  <wp:extent cx="2362200" cy="1469311"/>
+                  <wp:effectExtent l="0" t="0" r="0" b="0"/>
+                  <wp:docPr id="998317291" name="Imagen 1"/>
+                  <wp:cNvGraphicFramePr>
+                    <a:graphicFrameLocks xmlns:a="http://schemas.openxmlformats.org/drawingml/2006/main" noChangeAspect="1"/>
+                  </wp:cNvGraphicFramePr>
+                  <a:graphic xmlns:a="http://schemas.openxmlformats.org/drawingml/2006/main">
+                    <a:graphicData uri="http://schemas.openxmlformats.org/drawingml/2006/picture">
+                      <pic:pic xmlns:pic="http://schemas.openxmlformats.org/drawingml/2006/picture">
+                        <pic:nvPicPr>
+                          <pic:cNvPr id="998317291" name=""/>
+                          <pic:cNvPicPr/>
+                        </pic:nvPicPr>
+                        <pic:blipFill>
+                          <a:blip r:embed="rId10"/>
+                          <a:stretch>
+                            <a:fillRect/>
+                          </a:stretch>
+                        </pic:blipFill>
+                        <pic:spPr>
+                          <a:xfrm>
+                            <a:off x="0" y="0"/>
+                            <a:ext cx="2370073" cy="1474208"/>
+                          </a:xfrm>
+                          <a:prstGeom prst="rect">
+                            <a:avLst/>
+                          </a:prstGeom>
+                        </pic:spPr>
+                      </pic:pic>
+                    </a:graphicData>
+                  </a:graphic>
+                </wp:inline>
+              </w:drawing>
+            </w:r>
           </w:p>
         </w:tc>
         <w:tc>
@@ -1427,6 +1763,374 @@
                 <w:szCs w:val="16"/>
               </w:rPr>
             </w:pPr>
+            <w:r>
+              <w:rPr>
+                <w:sz w:val="16"/>
+                <w:szCs w:val="16"/>
+              </w:rPr>
+              <w:t>Esto cumplió con lo esperado, y esto es por la lógica existente que pronto será actualizada</w:t>
+            </w:r>
+          </w:p>
+        </w:tc>
+      </w:tr>
+      <w:tr>
+        <w:tc>
+          <w:tcPr>
+            <w:tcW w:w="192" w:type="dxa"/>
+          </w:tcPr>
+          <w:p>
+            <w:pPr>
+              <w:pStyle w:val="Sinespaciado"/>
+              <w:jc w:val="center"/>
+              <w:rPr>
+                <w:sz w:val="16"/>
+                <w:szCs w:val="16"/>
+              </w:rPr>
+            </w:pPr>
+            <w:r>
+              <w:rPr>
+                <w:sz w:val="16"/>
+                <w:szCs w:val="16"/>
+              </w:rPr>
+              <w:t>2</w:t>
+            </w:r>
+          </w:p>
+        </w:tc>
+        <w:tc>
+          <w:tcPr>
+            <w:tcW w:w="1002" w:type="dxa"/>
+          </w:tcPr>
+          <w:p>
+            <w:pPr>
+              <w:pStyle w:val="Sinespaciado"/>
+              <w:rPr>
+                <w:sz w:val="16"/>
+                <w:szCs w:val="16"/>
+              </w:rPr>
+            </w:pPr>
+            <w:r>
+              <w:rPr>
+                <w:sz w:val="16"/>
+                <w:szCs w:val="16"/>
+              </w:rPr>
+              <w:t xml:space="preserve">Registro de usuario con contraseñas menores a 4 caracteres </w:t>
+            </w:r>
+          </w:p>
+        </w:tc>
+        <w:tc>
+          <w:tcPr>
+            <w:tcW w:w="1408" w:type="dxa"/>
+          </w:tcPr>
+          <w:p>
+            <w:pPr>
+              <w:pStyle w:val="Sinespaciado"/>
+              <w:rPr>
+                <w:sz w:val="16"/>
+                <w:szCs w:val="16"/>
+              </w:rPr>
+            </w:pPr>
+            <w:r>
+              <w:rPr>
+                <w:sz w:val="16"/>
+                <w:szCs w:val="16"/>
+              </w:rPr>
+              <w:t xml:space="preserve">Ingresamos datos para registrando evitando la regla de negocio que nos dice que debemos ingresar </w:t>
+            </w:r>
+            <w:r>
+              <w:rPr>
+                <w:sz w:val="16"/>
+                <w:szCs w:val="16"/>
+              </w:rPr>
+              <w:t>contraseñas seguras</w:t>
+            </w:r>
+          </w:p>
+        </w:tc>
+        <w:tc>
+          <w:tcPr>
+            <w:tcW w:w="3046" w:type="dxa"/>
+          </w:tcPr>
+          <w:p>
+            <w:pPr>
+              <w:pStyle w:val="Sinespaciado"/>
+              <w:rPr>
+                <w:rFonts w:ascii="Courier New" w:hAnsi="Courier New" w:cs="Courier New"/>
+                <w:sz w:val="14"/>
+                <w:szCs w:val="14"/>
+              </w:rPr>
+            </w:pPr>
+            <w:r>
+              <w:rPr>
+                <w:rFonts w:ascii="Courier New" w:hAnsi="Courier New" w:cs="Courier New"/>
+                <w:sz w:val="14"/>
+                <w:szCs w:val="14"/>
+              </w:rPr>
+              <w:t>Nos debe denegar el registro lanzando una excepcion</w:t>
+            </w:r>
+          </w:p>
+        </w:tc>
+        <w:tc>
+          <w:tcPr>
+            <w:tcW w:w="7420" w:type="dxa"/>
+          </w:tcPr>
+          <w:p>
+            <w:pPr>
+              <w:pStyle w:val="Sinespaciado"/>
+            </w:pPr>
+            <w:r>
+              <w:drawing>
+                <wp:inline distT="0" distB="0" distL="0" distR="0" wp14:anchorId="4B5B8D34" wp14:editId="569ABA77">
+                  <wp:extent cx="2362200" cy="1912431"/>
+                  <wp:effectExtent l="0" t="0" r="0" b="0"/>
+                  <wp:docPr id="686283318" name="Imagen 1"/>
+                  <wp:cNvGraphicFramePr>
+                    <a:graphicFrameLocks xmlns:a="http://schemas.openxmlformats.org/drawingml/2006/main" noChangeAspect="1"/>
+                  </wp:cNvGraphicFramePr>
+                  <a:graphic xmlns:a="http://schemas.openxmlformats.org/drawingml/2006/main">
+                    <a:graphicData uri="http://schemas.openxmlformats.org/drawingml/2006/picture">
+                      <pic:pic xmlns:pic="http://schemas.openxmlformats.org/drawingml/2006/picture">
+                        <pic:nvPicPr>
+                          <pic:cNvPr id="686283318" name=""/>
+                          <pic:cNvPicPr/>
+                        </pic:nvPicPr>
+                        <pic:blipFill>
+                          <a:blip r:embed="rId11"/>
+                          <a:stretch>
+                            <a:fillRect/>
+                          </a:stretch>
+                        </pic:blipFill>
+                        <pic:spPr>
+                          <a:xfrm flipV="1">
+                            <a:off x="0" y="0"/>
+                            <a:ext cx="2373864" cy="1921874"/>
+                          </a:xfrm>
+                          <a:prstGeom prst="rect">
+                            <a:avLst/>
+                          </a:prstGeom>
+                        </pic:spPr>
+                      </pic:pic>
+                    </a:graphicData>
+                  </a:graphic>
+                </wp:inline>
+              </w:drawing>
+            </w:r>
+          </w:p>
+        </w:tc>
+        <w:tc>
+          <w:tcPr>
+            <w:tcW w:w="1673" w:type="dxa"/>
+          </w:tcPr>
+          <w:p>
+            <w:pPr>
+              <w:pStyle w:val="Sinespaciado"/>
+              <w:rPr>
+                <w:sz w:val="16"/>
+                <w:szCs w:val="16"/>
+              </w:rPr>
+            </w:pPr>
+            <w:r>
+              <w:rPr>
+                <w:sz w:val="16"/>
+                <w:szCs w:val="16"/>
+              </w:rPr>
+              <w:t>Esto hace falta trabajar ya que en esta parte solo marcamos el recorrido para marcar un flujo y conectar con las funciones ya establecidas de forma segura</w:t>
+            </w:r>
+          </w:p>
+        </w:tc>
+      </w:tr>
+      <w:tr>
+        <w:tc>
+          <w:tcPr>
+            <w:tcW w:w="192" w:type="dxa"/>
+          </w:tcPr>
+          <w:p>
+            <w:pPr>
+              <w:pStyle w:val="Sinespaciado"/>
+              <w:jc w:val="center"/>
+              <w:rPr>
+                <w:sz w:val="16"/>
+                <w:szCs w:val="16"/>
+              </w:rPr>
+            </w:pPr>
+            <w:r>
+              <w:rPr>
+                <w:sz w:val="16"/>
+                <w:szCs w:val="16"/>
+              </w:rPr>
+              <w:lastRenderedPageBreak/>
+              <w:t>3</w:t>
+            </w:r>
+          </w:p>
+        </w:tc>
+        <w:tc>
+          <w:tcPr>
+            <w:tcW w:w="1002" w:type="dxa"/>
+          </w:tcPr>
+          <w:p>
+            <w:pPr>
+              <w:pStyle w:val="Sinespaciado"/>
+              <w:rPr>
+                <w:sz w:val="16"/>
+                <w:szCs w:val="16"/>
+              </w:rPr>
+            </w:pPr>
+            <w:r>
+              <w:rPr>
+                <w:sz w:val="16"/>
+                <w:szCs w:val="16"/>
+              </w:rPr>
+              <w:t>Olvide mi contraseña</w:t>
+            </w:r>
+          </w:p>
+        </w:tc>
+        <w:tc>
+          <w:tcPr>
+            <w:tcW w:w="1408" w:type="dxa"/>
+          </w:tcPr>
+          <w:p>
+            <w:pPr>
+              <w:pStyle w:val="Sinespaciado"/>
+              <w:rPr>
+                <w:sz w:val="16"/>
+                <w:szCs w:val="16"/>
+              </w:rPr>
+            </w:pPr>
+            <w:r>
+              <w:rPr>
+                <w:sz w:val="16"/>
+                <w:szCs w:val="16"/>
+              </w:rPr>
+              <w:t>Intentamos entrar a la opción olvide mi contraseña</w:t>
+            </w:r>
+          </w:p>
+        </w:tc>
+        <w:tc>
+          <w:tcPr>
+            <w:tcW w:w="3046" w:type="dxa"/>
+          </w:tcPr>
+          <w:p>
+            <w:pPr>
+              <w:pStyle w:val="Sinespaciado"/>
+              <w:rPr>
+                <w:rFonts w:ascii="Courier New" w:hAnsi="Courier New" w:cs="Courier New"/>
+                <w:sz w:val="14"/>
+                <w:szCs w:val="14"/>
+              </w:rPr>
+            </w:pPr>
+            <w:r>
+              <w:rPr>
+                <w:rFonts w:ascii="Courier New" w:hAnsi="Courier New" w:cs="Courier New"/>
+                <w:sz w:val="14"/>
+                <w:szCs w:val="14"/>
+              </w:rPr>
+              <w:t xml:space="preserve">Esperamos que muestre el flujo que le corresponde a esta pantalla, como un </w:t>
+            </w:r>
+            <w:proofErr w:type="spellStart"/>
+            <w:r>
+              <w:rPr>
+                <w:rFonts w:ascii="Courier New" w:hAnsi="Courier New" w:cs="Courier New"/>
+                <w:sz w:val="14"/>
+                <w:szCs w:val="14"/>
+              </w:rPr>
+              <w:t>frame</w:t>
+            </w:r>
+            <w:proofErr w:type="spellEnd"/>
+            <w:r>
+              <w:rPr>
+                <w:rFonts w:ascii="Courier New" w:hAnsi="Courier New" w:cs="Courier New"/>
+                <w:sz w:val="14"/>
+                <w:szCs w:val="14"/>
+              </w:rPr>
+              <w:t xml:space="preserve"> dedicado a dar soporte o resolver este problema</w:t>
+            </w:r>
+          </w:p>
+        </w:tc>
+        <w:tc>
+          <w:tcPr>
+            <w:tcW w:w="7420" w:type="dxa"/>
+          </w:tcPr>
+          <w:p>
+            <w:pPr>
+              <w:pStyle w:val="Sinespaciado"/>
+            </w:pPr>
+            <w:r>
+              <w:drawing>
+                <wp:inline distT="0" distB="0" distL="0" distR="0" wp14:anchorId="23179FE1" wp14:editId="2FC15728">
+                  <wp:extent cx="2028825" cy="1615546"/>
+                  <wp:effectExtent l="0" t="0" r="0" b="0"/>
+                  <wp:docPr id="1642863856" name="Imagen 1"/>
+                  <wp:cNvGraphicFramePr>
+                    <a:graphicFrameLocks xmlns:a="http://schemas.openxmlformats.org/drawingml/2006/main" noChangeAspect="1"/>
+                  </wp:cNvGraphicFramePr>
+                  <a:graphic xmlns:a="http://schemas.openxmlformats.org/drawingml/2006/main">
+                    <a:graphicData uri="http://schemas.openxmlformats.org/drawingml/2006/picture">
+                      <pic:pic xmlns:pic="http://schemas.openxmlformats.org/drawingml/2006/picture">
+                        <pic:nvPicPr>
+                          <pic:cNvPr id="1642863856" name=""/>
+                          <pic:cNvPicPr/>
+                        </pic:nvPicPr>
+                        <pic:blipFill>
+                          <a:blip r:embed="rId12"/>
+                          <a:stretch>
+                            <a:fillRect/>
+                          </a:stretch>
+                        </pic:blipFill>
+                        <pic:spPr>
+                          <a:xfrm>
+                            <a:off x="0" y="0"/>
+                            <a:ext cx="2037096" cy="1622132"/>
+                          </a:xfrm>
+                          <a:prstGeom prst="rect">
+                            <a:avLst/>
+                          </a:prstGeom>
+                        </pic:spPr>
+                      </pic:pic>
+                    </a:graphicData>
+                  </a:graphic>
+                </wp:inline>
+              </w:drawing>
+            </w:r>
+          </w:p>
+        </w:tc>
+        <w:tc>
+          <w:tcPr>
+            <w:tcW w:w="1673" w:type="dxa"/>
+          </w:tcPr>
+          <w:p>
+            <w:pPr>
+              <w:pStyle w:val="Sinespaciado"/>
+              <w:rPr>
+                <w:sz w:val="16"/>
+                <w:szCs w:val="16"/>
+              </w:rPr>
+            </w:pPr>
+            <w:r>
+              <w:rPr>
+                <w:sz w:val="16"/>
+                <w:szCs w:val="16"/>
+              </w:rPr>
+              <w:t xml:space="preserve">No pudimos entrar a este flujo, esto se debe a que este flujo aun no esta trabajado y no esta contemplado en la planeación, pero si </w:t>
+            </w:r>
+            <w:r>
+              <w:rPr>
+                <w:sz w:val="16"/>
+                <w:szCs w:val="16"/>
+              </w:rPr>
+              <w:t>está</w:t>
+            </w:r>
+            <w:r>
+              <w:rPr>
+                <w:sz w:val="16"/>
+                <w:szCs w:val="16"/>
+              </w:rPr>
+              <w:t xml:space="preserve"> contemplado para a</w:t>
+            </w:r>
+            <w:r>
+              <w:rPr>
+                <w:sz w:val="16"/>
+                <w:szCs w:val="16"/>
+              </w:rPr>
+              <w:t>gregarse al avanzar en las iteraciones.</w:t>
+            </w:r>
           </w:p>
         </w:tc>
       </w:tr>
@@ -1435,8 +2139,6 @@
       <w:pPr>
         <w:pStyle w:val="Sinespaciado"/>
       </w:pPr>
-      <w:bookmarkStart w:id="0" w:name="_GoBack"/>
-      <w:bookmarkEnd w:id="0"/>
     </w:p>
     <w:sectPr>
       <w:pgSz w:w="15840" w:h="12240" w:orient="landscape"/>
@@ -1449,8 +2151,8 @@
 </file>
 
 <file path=word/numbering.xml><?xml version="1.0" encoding="utf-8"?>
-<w:numbering xmlns:ve="http://schemas.openxmlformats.org/markup-compatibility/2006" xmlns:o="urn:schemas-microsoft-com:office:office" xmlns:r="http://schemas.openxmlformats.org/officeDocument/2006/relationships" xmlns:m="http://schemas.openxmlformats.org/officeDocument/2006/math" xmlns:v="urn:schemas-microsoft-com:vml" xmlns:wp="http://schemas.openxmlformats.org/drawingml/2006/wordprocessingDrawing" xmlns:w10="urn:schemas-microsoft-com:office:word" xmlns:w="http://schemas.openxmlformats.org/wordprocessingml/2006/main" xmlns:wne="http://schemas.microsoft.com/office/word/2006/wordml">
-  <w:abstractNum w:abstractNumId="0">
+<w:numbering xmlns:wpc="http://schemas.microsoft.com/office/word/2010/wordprocessingCanvas" xmlns:cx="http://schemas.microsoft.com/office/drawing/2014/chartex" xmlns:cx1="http://schemas.microsoft.com/office/drawing/2015/9/8/chartex" xmlns:cx2="http://schemas.microsoft.com/office/drawing/2015/10/21/chartex" xmlns:cx3="http://schemas.microsoft.com/office/drawing/2016/5/9/chartex" xmlns:cx4="http://schemas.microsoft.com/office/drawing/2016/5/10/chartex" xmlns:cx5="http://schemas.microsoft.com/office/drawing/2016/5/11/chartex" xmlns:cx6="http://schemas.microsoft.com/office/drawing/2016/5/12/chartex" xmlns:cx7="http://schemas.microsoft.com/office/drawing/2016/5/13/chartex" xmlns:cx8="http://schemas.microsoft.com/office/drawing/2016/5/14/chartex" xmlns:mc="http://schemas.openxmlformats.org/markup-compatibility/2006" xmlns:aink="http://schemas.microsoft.com/office/drawing/2016/ink" xmlns:am3d="http://schemas.microsoft.com/office/drawing/2017/model3d" xmlns:o="urn:schemas-microsoft-com:office:office" xmlns:oel="http://schemas.microsoft.com/office/2019/extlst" xmlns:r="http://schemas.openxmlformats.org/officeDocument/2006/relationships" xmlns:m="http://schemas.openxmlformats.org/officeDocument/2006/math" xmlns:v="urn:schemas-microsoft-com:vml" xmlns:wp14="http://schemas.microsoft.com/office/word/2010/wordprocessingDrawing" xmlns:wp="http://schemas.openxmlformats.org/drawingml/2006/wordprocessingDrawing" xmlns:w10="urn:schemas-microsoft-com:office:word" xmlns:w="http://schemas.openxmlformats.org/wordprocessingml/2006/main" xmlns:w14="http://schemas.microsoft.com/office/word/2010/wordml" xmlns:w15="http://schemas.microsoft.com/office/word/2012/wordml" xmlns:w16cex="http://schemas.microsoft.com/office/word/2018/wordml/cex" xmlns:w16cid="http://schemas.microsoft.com/office/word/2016/wordml/cid" xmlns:w16="http://schemas.microsoft.com/office/word/2018/wordml" xmlns:w16du="http://schemas.microsoft.com/office/word/2023/wordml/word16du" xmlns:w16sdtdh="http://schemas.microsoft.com/office/word/2020/wordml/sdtdatahash" xmlns:w16sdtfl="http://schemas.microsoft.com/office/word/2024/wordml/sdtformatlock" xmlns:w16se="http://schemas.microsoft.com/office/word/2015/wordml/symex" xmlns:wpg="http://schemas.microsoft.com/office/word/2010/wordprocessingGroup" xmlns:wpi="http://schemas.microsoft.com/office/word/2010/wordprocessingInk" xmlns:wne="http://schemas.microsoft.com/office/word/2006/wordml" xmlns:wps="http://schemas.microsoft.com/office/word/2010/wordprocessingShape" mc:Ignorable="w14 w15 w16se w16cid w16 w16cex w16sdtdh w16sdtfl w16du wp14">
+  <w:abstractNum w:abstractNumId="0" w15:restartNumberingAfterBreak="0">
     <w:nsid w:val="07951AD0"/>
     <w:multiLevelType w:val="hybridMultilevel"/>
     <w:tmpl w:val="88D4B8CE"/>
@@ -1563,14 +2265,14 @@
       </w:rPr>
     </w:lvl>
   </w:abstractNum>
-  <w:num w:numId="1">
+  <w:num w:numId="1" w16cid:durableId="1566262128">
     <w:abstractNumId w:val="0"/>
   </w:num>
 </w:numbering>
 </file>
 
 <file path=word/styles.xml><?xml version="1.0" encoding="utf-8"?>
-<w:styles xmlns:r="http://schemas.openxmlformats.org/officeDocument/2006/relationships" xmlns:w="http://schemas.openxmlformats.org/wordprocessingml/2006/main">
+<w:styles xmlns:mc="http://schemas.openxmlformats.org/markup-compatibility/2006" xmlns:r="http://schemas.openxmlformats.org/officeDocument/2006/relationships" xmlns:w="http://schemas.openxmlformats.org/wordprocessingml/2006/main" xmlns:w14="http://schemas.microsoft.com/office/word/2010/wordml" xmlns:w15="http://schemas.microsoft.com/office/word/2012/wordml" xmlns:w16cex="http://schemas.microsoft.com/office/word/2018/wordml/cex" xmlns:w16cid="http://schemas.microsoft.com/office/word/2016/wordml/cid" xmlns:w16="http://schemas.microsoft.com/office/word/2018/wordml" xmlns:w16du="http://schemas.microsoft.com/office/word/2023/wordml/word16du" xmlns:w16sdtdh="http://schemas.microsoft.com/office/word/2020/wordml/sdtdatahash" xmlns:w16sdtfl="http://schemas.microsoft.com/office/word/2024/wordml/sdtformatlock" xmlns:w16se="http://schemas.microsoft.com/office/word/2015/wordml/symex" mc:Ignorable="w14 w15 w16se w16cid w16 w16cex w16sdtdh w16sdtfl w16du">
   <w:docDefaults>
     <w:rPrDefault>
       <w:rPr>
@@ -1586,144 +2288,383 @@
       </w:pPr>
     </w:pPrDefault>
   </w:docDefaults>
-  <w:latentStyles w:defLockedState="0" w:defUIPriority="99" w:defSemiHidden="1" w:defUnhideWhenUsed="1" w:defQFormat="0" w:count="267">
-    <w:lsdException w:name="Normal" w:semiHidden="0" w:uiPriority="0" w:unhideWhenUsed="0" w:qFormat="1"/>
-    <w:lsdException w:name="heading 1" w:semiHidden="0" w:uiPriority="9" w:unhideWhenUsed="0" w:qFormat="1"/>
-    <w:lsdException w:name="heading 2" w:uiPriority="9" w:qFormat="1"/>
-    <w:lsdException w:name="heading 3" w:uiPriority="9" w:qFormat="1"/>
-    <w:lsdException w:name="heading 4" w:uiPriority="9" w:qFormat="1"/>
-    <w:lsdException w:name="heading 5" w:uiPriority="9" w:qFormat="1"/>
-    <w:lsdException w:name="heading 6" w:uiPriority="9" w:qFormat="1"/>
-    <w:lsdException w:name="heading 7" w:uiPriority="9" w:qFormat="1"/>
-    <w:lsdException w:name="heading 8" w:uiPriority="9" w:qFormat="1"/>
-    <w:lsdException w:name="heading 9" w:uiPriority="9" w:qFormat="1"/>
-    <w:lsdException w:name="toc 1" w:uiPriority="39"/>
-    <w:lsdException w:name="toc 2" w:uiPriority="39"/>
-    <w:lsdException w:name="toc 3" w:uiPriority="39"/>
-    <w:lsdException w:name="toc 4" w:uiPriority="39"/>
-    <w:lsdException w:name="toc 5" w:uiPriority="39"/>
-    <w:lsdException w:name="toc 6" w:uiPriority="39"/>
-    <w:lsdException w:name="toc 7" w:uiPriority="39"/>
-    <w:lsdException w:name="toc 8" w:uiPriority="39"/>
-    <w:lsdException w:name="toc 9" w:uiPriority="39"/>
-    <w:lsdException w:name="caption" w:uiPriority="35" w:qFormat="1"/>
-    <w:lsdException w:name="Title" w:semiHidden="0" w:uiPriority="10" w:unhideWhenUsed="0" w:qFormat="1"/>
-    <w:lsdException w:name="Default Paragraph Font" w:uiPriority="1"/>
-    <w:lsdException w:name="Subtitle" w:semiHidden="0" w:uiPriority="11" w:unhideWhenUsed="0" w:qFormat="1"/>
-    <w:lsdException w:name="Strong" w:semiHidden="0" w:uiPriority="22" w:unhideWhenUsed="0" w:qFormat="1"/>
-    <w:lsdException w:name="Emphasis" w:semiHidden="0" w:uiPriority="20" w:unhideWhenUsed="0" w:qFormat="1"/>
-    <w:lsdException w:name="Table Grid" w:semiHidden="0" w:uiPriority="39" w:unhideWhenUsed="0"/>
-    <w:lsdException w:name="Placeholder Text" w:unhideWhenUsed="0"/>
-    <w:lsdException w:name="No Spacing" w:semiHidden="0" w:uiPriority="1" w:unhideWhenUsed="0" w:qFormat="1"/>
-    <w:lsdException w:name="Light Shading" w:semiHidden="0" w:uiPriority="60" w:unhideWhenUsed="0"/>
-    <w:lsdException w:name="Light List" w:semiHidden="0" w:uiPriority="61" w:unhideWhenUsed="0"/>
-    <w:lsdException w:name="Light Grid" w:semiHidden="0" w:uiPriority="62" w:unhideWhenUsed="0"/>
-    <w:lsdException w:name="Medium Shading 1" w:semiHidden="0" w:uiPriority="63" w:unhideWhenUsed="0"/>
-    <w:lsdException w:name="Medium Shading 2" w:semiHidden="0" w:uiPriority="64" w:unhideWhenUsed="0"/>
-    <w:lsdException w:name="Medium List 1" w:semiHidden="0" w:uiPriority="65" w:unhideWhenUsed="0"/>
-    <w:lsdException w:name="Medium List 2" w:semiHidden="0" w:uiPriority="66" w:unhideWhenUsed="0"/>
-    <w:lsdException w:name="Medium Grid 1" w:semiHidden="0" w:uiPriority="67" w:unhideWhenUsed="0"/>
-    <w:lsdException w:name="Medium Grid 2" w:semiHidden="0" w:uiPriority="68" w:unhideWhenUsed="0"/>
-    <w:lsdException w:name="Medium Grid 3" w:semiHidden="0" w:uiPriority="69" w:unhideWhenUsed="0"/>
-    <w:lsdException w:name="Dark List" w:semiHidden="0" w:uiPriority="70" w:unhideWhenUsed="0"/>
-    <w:lsdException w:name="Colorful Shading" w:semiHidden="0" w:uiPriority="71" w:unhideWhenUsed="0"/>
-    <w:lsdException w:name="Colorful List" w:semiHidden="0" w:uiPriority="72" w:unhideWhenUsed="0"/>
-    <w:lsdException w:name="Colorful Grid" w:semiHidden="0" w:uiPriority="73" w:unhideWhenUsed="0"/>
-    <w:lsdException w:name="Light Shading Accent 1" w:semiHidden="0" w:uiPriority="60" w:unhideWhenUsed="0"/>
-    <w:lsdException w:name="Light List Accent 1" w:semiHidden="0" w:uiPriority="61" w:unhideWhenUsed="0"/>
-    <w:lsdException w:name="Light Grid Accent 1" w:semiHidden="0" w:uiPriority="62" w:unhideWhenUsed="0"/>
-    <w:lsdException w:name="Medium Shading 1 Accent 1" w:semiHidden="0" w:uiPriority="63" w:unhideWhenUsed="0"/>
-    <w:lsdException w:name="Medium Shading 2 Accent 1" w:semiHidden="0" w:uiPriority="64" w:unhideWhenUsed="0"/>
-    <w:lsdException w:name="Medium List 1 Accent 1" w:semiHidden="0" w:uiPriority="65" w:unhideWhenUsed="0"/>
-    <w:lsdException w:name="Revision" w:unhideWhenUsed="0"/>
-    <w:lsdException w:name="List Paragraph" w:semiHidden="0" w:uiPriority="34" w:unhideWhenUsed="0" w:qFormat="1"/>
-    <w:lsdException w:name="Quote" w:semiHidden="0" w:uiPriority="29" w:unhideWhenUsed="0" w:qFormat="1"/>
-    <w:lsdException w:name="Intense Quote" w:semiHidden="0" w:uiPriority="30" w:unhideWhenUsed="0" w:qFormat="1"/>
-    <w:lsdException w:name="Medium List 2 Accent 1" w:semiHidden="0" w:uiPriority="66" w:unhideWhenUsed="0"/>
-    <w:lsdException w:name="Medium Grid 1 Accent 1" w:semiHidden="0" w:uiPriority="67" w:unhideWhenUsed="0"/>
-    <w:lsdException w:name="Medium Grid 2 Accent 1" w:semiHidden="0" w:uiPriority="68" w:unhideWhenUsed="0"/>
-    <w:lsdException w:name="Medium Grid 3 Accent 1" w:semiHidden="0" w:uiPriority="69" w:unhideWhenUsed="0"/>
-    <w:lsdException w:name="Dark List Accent 1" w:semiHidden="0" w:uiPriority="70" w:unhideWhenUsed="0"/>
-    <w:lsdException w:name="Colorful Shading Accent 1" w:semiHidden="0" w:uiPriority="71" w:unhideWhenUsed="0"/>
-    <w:lsdException w:name="Colorful List Accent 1" w:semiHidden="0" w:uiPriority="72" w:unhideWhenUsed="0"/>
-    <w:lsdException w:name="Colorful Grid Accent 1" w:semiHidden="0" w:uiPriority="73" w:unhideWhenUsed="0"/>
-    <w:lsdException w:name="Light Shading Accent 2" w:semiHidden="0" w:uiPriority="60" w:unhideWhenUsed="0"/>
-    <w:lsdException w:name="Light List Accent 2" w:semiHidden="0" w:uiPriority="61" w:unhideWhenUsed="0"/>
-    <w:lsdException w:name="Light Grid Accent 2" w:semiHidden="0" w:uiPriority="62" w:unhideWhenUsed="0"/>
-    <w:lsdException w:name="Medium Shading 1 Accent 2" w:semiHidden="0" w:uiPriority="63" w:unhideWhenUsed="0"/>
-    <w:lsdException w:name="Medium Shading 2 Accent 2" w:semiHidden="0" w:uiPriority="64" w:unhideWhenUsed="0"/>
-    <w:lsdException w:name="Medium List 1 Accent 2" w:semiHidden="0" w:uiPriority="65" w:unhideWhenUsed="0"/>
-    <w:lsdException w:name="Medium List 2 Accent 2" w:semiHidden="0" w:uiPriority="66" w:unhideWhenUsed="0"/>
-    <w:lsdException w:name="Medium Grid 1 Accent 2" w:semiHidden="0" w:uiPriority="67" w:unhideWhenUsed="0"/>
-    <w:lsdException w:name="Medium Grid 2 Accent 2" w:semiHidden="0" w:uiPriority="68" w:unhideWhenUsed="0"/>
-    <w:lsdException w:name="Medium Grid 3 Accent 2" w:semiHidden="0" w:uiPriority="69" w:unhideWhenUsed="0"/>
-    <w:lsdException w:name="Dark List Accent 2" w:semiHidden="0" w:uiPriority="70" w:unhideWhenUsed="0"/>
-    <w:lsdException w:name="Colorful Shading Accent 2" w:semiHidden="0" w:uiPriority="71" w:unhideWhenUsed="0"/>
-    <w:lsdException w:name="Colorful List Accent 2" w:semiHidden="0" w:uiPriority="72" w:unhideWhenUsed="0"/>
-    <w:lsdException w:name="Colorful Grid Accent 2" w:semiHidden="0" w:uiPriority="73" w:unhideWhenUsed="0"/>
-    <w:lsdException w:name="Light Shading Accent 3" w:semiHidden="0" w:uiPriority="60" w:unhideWhenUsed="0"/>
-    <w:lsdException w:name="Light List Accent 3" w:semiHidden="0" w:uiPriority="61" w:unhideWhenUsed="0"/>
-    <w:lsdException w:name="Light Grid Accent 3" w:semiHidden="0" w:uiPriority="62" w:unhideWhenUsed="0"/>
-    <w:lsdException w:name="Medium Shading 1 Accent 3" w:semiHidden="0" w:uiPriority="63" w:unhideWhenUsed="0"/>
-    <w:lsdException w:name="Medium Shading 2 Accent 3" w:semiHidden="0" w:uiPriority="64" w:unhideWhenUsed="0"/>
-    <w:lsdException w:name="Medium List 1 Accent 3" w:semiHidden="0" w:uiPriority="65" w:unhideWhenUsed="0"/>
-    <w:lsdException w:name="Medium List 2 Accent 3" w:semiHidden="0" w:uiPriority="66" w:unhideWhenUsed="0"/>
-    <w:lsdException w:name="Medium Grid 1 Accent 3" w:semiHidden="0" w:uiPriority="67" w:unhideWhenUsed="0"/>
-    <w:lsdException w:name="Medium Grid 2 Accent 3" w:semiHidden="0" w:uiPriority="68" w:unhideWhenUsed="0"/>
-    <w:lsdException w:name="Medium Grid 3 Accent 3" w:semiHidden="0" w:uiPriority="69" w:unhideWhenUsed="0"/>
-    <w:lsdException w:name="Dark List Accent 3" w:semiHidden="0" w:uiPriority="70" w:unhideWhenUsed="0"/>
-    <w:lsdException w:name="Colorful Shading Accent 3" w:semiHidden="0" w:uiPriority="71" w:unhideWhenUsed="0"/>
-    <w:lsdException w:name="Colorful List Accent 3" w:semiHidden="0" w:uiPriority="72" w:unhideWhenUsed="0"/>
-    <w:lsdException w:name="Colorful Grid Accent 3" w:semiHidden="0" w:uiPriority="73" w:unhideWhenUsed="0"/>
-    <w:lsdException w:name="Light Shading Accent 4" w:semiHidden="0" w:uiPriority="60" w:unhideWhenUsed="0"/>
-    <w:lsdException w:name="Light List Accent 4" w:semiHidden="0" w:uiPriority="61" w:unhideWhenUsed="0"/>
-    <w:lsdException w:name="Light Grid Accent 4" w:semiHidden="0" w:uiPriority="62" w:unhideWhenUsed="0"/>
-    <w:lsdException w:name="Medium Shading 1 Accent 4" w:semiHidden="0" w:uiPriority="63" w:unhideWhenUsed="0"/>
-    <w:lsdException w:name="Medium Shading 2 Accent 4" w:semiHidden="0" w:uiPriority="64" w:unhideWhenUsed="0"/>
-    <w:lsdException w:name="Medium List 1 Accent 4" w:semiHidden="0" w:uiPriority="65" w:unhideWhenUsed="0"/>
-    <w:lsdException w:name="Medium List 2 Accent 4" w:semiHidden="0" w:uiPriority="66" w:unhideWhenUsed="0"/>
-    <w:lsdException w:name="Medium Grid 1 Accent 4" w:semiHidden="0" w:uiPriority="67" w:unhideWhenUsed="0"/>
-    <w:lsdException w:name="Medium Grid 2 Accent 4" w:semiHidden="0" w:uiPriority="68" w:unhideWhenUsed="0"/>
-    <w:lsdException w:name="Medium Grid 3 Accent 4" w:semiHidden="0" w:uiPriority="69" w:unhideWhenUsed="0"/>
-    <w:lsdException w:name="Dark List Accent 4" w:semiHidden="0" w:uiPriority="70" w:unhideWhenUsed="0"/>
-    <w:lsdException w:name="Colorful Shading Accent 4" w:semiHidden="0" w:uiPriority="71" w:unhideWhenUsed="0"/>
-    <w:lsdException w:name="Colorful List Accent 4" w:semiHidden="0" w:uiPriority="72" w:unhideWhenUsed="0"/>
-    <w:lsdException w:name="Colorful Grid Accent 4" w:semiHidden="0" w:uiPriority="73" w:unhideWhenUsed="0"/>
-    <w:lsdException w:name="Light Shading Accent 5" w:semiHidden="0" w:uiPriority="60" w:unhideWhenUsed="0"/>
-    <w:lsdException w:name="Light List Accent 5" w:semiHidden="0" w:uiPriority="61" w:unhideWhenUsed="0"/>
-    <w:lsdException w:name="Light Grid Accent 5" w:semiHidden="0" w:uiPriority="62" w:unhideWhenUsed="0"/>
-    <w:lsdException w:name="Medium Shading 1 Accent 5" w:semiHidden="0" w:uiPriority="63" w:unhideWhenUsed="0"/>
-    <w:lsdException w:name="Medium Shading 2 Accent 5" w:semiHidden="0" w:uiPriority="64" w:unhideWhenUsed="0"/>
-    <w:lsdException w:name="Medium List 1 Accent 5" w:semiHidden="0" w:uiPriority="65" w:unhideWhenUsed="0"/>
-    <w:lsdException w:name="Medium List 2 Accent 5" w:semiHidden="0" w:uiPriority="66" w:unhideWhenUsed="0"/>
-    <w:lsdException w:name="Medium Grid 1 Accent 5" w:semiHidden="0" w:uiPriority="67" w:unhideWhenUsed="0"/>
-    <w:lsdException w:name="Medium Grid 2 Accent 5" w:semiHidden="0" w:uiPriority="68" w:unhideWhenUsed="0"/>
-    <w:lsdException w:name="Medium Grid 3 Accent 5" w:semiHidden="0" w:uiPriority="69" w:unhideWhenUsed="0"/>
-    <w:lsdException w:name="Dark List Accent 5" w:semiHidden="0" w:uiPriority="70" w:unhideWhenUsed="0"/>
-    <w:lsdException w:name="Colorful Shading Accent 5" w:semiHidden="0" w:uiPriority="71" w:unhideWhenUsed="0"/>
-    <w:lsdException w:name="Colorful List Accent 5" w:semiHidden="0" w:uiPriority="72" w:unhideWhenUsed="0"/>
-    <w:lsdException w:name="Colorful Grid Accent 5" w:semiHidden="0" w:uiPriority="73" w:unhideWhenUsed="0"/>
-    <w:lsdException w:name="Light Shading Accent 6" w:semiHidden="0" w:uiPriority="60" w:unhideWhenUsed="0"/>
-    <w:lsdException w:name="Light List Accent 6" w:semiHidden="0" w:uiPriority="61" w:unhideWhenUsed="0"/>
-    <w:lsdException w:name="Light Grid Accent 6" w:semiHidden="0" w:uiPriority="62" w:unhideWhenUsed="0"/>
-    <w:lsdException w:name="Medium Shading 1 Accent 6" w:semiHidden="0" w:uiPriority="63" w:unhideWhenUsed="0"/>
-    <w:lsdException w:name="Medium Shading 2 Accent 6" w:semiHidden="0" w:uiPriority="64" w:unhideWhenUsed="0"/>
-    <w:lsdException w:name="Medium List 1 Accent 6" w:semiHidden="0" w:uiPriority="65" w:unhideWhenUsed="0"/>
-    <w:lsdException w:name="Medium List 2 Accent 6" w:semiHidden="0" w:uiPriority="66" w:unhideWhenUsed="0"/>
-    <w:lsdException w:name="Medium Grid 1 Accent 6" w:semiHidden="0" w:uiPriority="67" w:unhideWhenUsed="0"/>
-    <w:lsdException w:name="Medium Grid 2 Accent 6" w:semiHidden="0" w:uiPriority="68" w:unhideWhenUsed="0"/>
-    <w:lsdException w:name="Medium Grid 3 Accent 6" w:semiHidden="0" w:uiPriority="69" w:unhideWhenUsed="0"/>
-    <w:lsdException w:name="Dark List Accent 6" w:semiHidden="0" w:uiPriority="70" w:unhideWhenUsed="0"/>
-    <w:lsdException w:name="Colorful Shading Accent 6" w:semiHidden="0" w:uiPriority="71" w:unhideWhenUsed="0"/>
-    <w:lsdException w:name="Colorful List Accent 6" w:semiHidden="0" w:uiPriority="72" w:unhideWhenUsed="0"/>
-    <w:lsdException w:name="Colorful Grid Accent 6" w:semiHidden="0" w:uiPriority="73" w:unhideWhenUsed="0"/>
-    <w:lsdException w:name="Subtle Emphasis" w:semiHidden="0" w:uiPriority="19" w:unhideWhenUsed="0" w:qFormat="1"/>
-    <w:lsdException w:name="Intense Emphasis" w:semiHidden="0" w:uiPriority="21" w:unhideWhenUsed="0" w:qFormat="1"/>
-    <w:lsdException w:name="Subtle Reference" w:semiHidden="0" w:uiPriority="31" w:unhideWhenUsed="0" w:qFormat="1"/>
-    <w:lsdException w:name="Intense Reference" w:semiHidden="0" w:uiPriority="32" w:unhideWhenUsed="0" w:qFormat="1"/>
-    <w:lsdException w:name="Book Title" w:semiHidden="0" w:uiPriority="33" w:unhideWhenUsed="0" w:qFormat="1"/>
-    <w:lsdException w:name="Bibliography" w:uiPriority="37"/>
-    <w:lsdException w:name="TOC Heading" w:uiPriority="39" w:qFormat="1"/>
+  <w:latentStyles w:defLockedState="0" w:defUIPriority="99" w:defSemiHidden="0" w:defUnhideWhenUsed="0" w:defQFormat="0" w:count="376">
+    <w:lsdException w:name="Normal" w:uiPriority="0" w:qFormat="1"/>
+    <w:lsdException w:name="heading 1" w:uiPriority="9" w:qFormat="1"/>
+    <w:lsdException w:name="heading 2" w:semiHidden="1" w:uiPriority="9" w:unhideWhenUsed="1" w:qFormat="1"/>
+    <w:lsdException w:name="heading 3" w:semiHidden="1" w:uiPriority="9" w:unhideWhenUsed="1" w:qFormat="1"/>
+    <w:lsdException w:name="heading 4" w:semiHidden="1" w:uiPriority="9" w:unhideWhenUsed="1" w:qFormat="1"/>
+    <w:lsdException w:name="heading 5" w:semiHidden="1" w:uiPriority="9" w:unhideWhenUsed="1" w:qFormat="1"/>
+    <w:lsdException w:name="heading 6" w:semiHidden="1" w:uiPriority="9" w:unhideWhenUsed="1" w:qFormat="1"/>
+    <w:lsdException w:name="heading 7" w:semiHidden="1" w:uiPriority="9" w:unhideWhenUsed="1" w:qFormat="1"/>
+    <w:lsdException w:name="heading 8" w:semiHidden="1" w:uiPriority="9" w:unhideWhenUsed="1" w:qFormat="1"/>
+    <w:lsdException w:name="heading 9" w:semiHidden="1" w:uiPriority="9" w:unhideWhenUsed="1" w:qFormat="1"/>
+    <w:lsdException w:name="index 1" w:semiHidden="1" w:unhideWhenUsed="1"/>
+    <w:lsdException w:name="index 2" w:semiHidden="1" w:unhideWhenUsed="1"/>
+    <w:lsdException w:name="index 3" w:semiHidden="1" w:unhideWhenUsed="1"/>
+    <w:lsdException w:name="index 4" w:semiHidden="1" w:unhideWhenUsed="1"/>
+    <w:lsdException w:name="index 5" w:semiHidden="1" w:unhideWhenUsed="1"/>
+    <w:lsdException w:name="index 6" w:semiHidden="1" w:unhideWhenUsed="1"/>
+    <w:lsdException w:name="index 7" w:semiHidden="1" w:unhideWhenUsed="1"/>
+    <w:lsdException w:name="index 8" w:semiHidden="1" w:unhideWhenUsed="1"/>
+    <w:lsdException w:name="index 9" w:semiHidden="1" w:unhideWhenUsed="1"/>
+    <w:lsdException w:name="toc 1" w:semiHidden="1" w:uiPriority="39" w:unhideWhenUsed="1"/>
+    <w:lsdException w:name="toc 2" w:semiHidden="1" w:uiPriority="39" w:unhideWhenUsed="1"/>
+    <w:lsdException w:name="toc 3" w:semiHidden="1" w:uiPriority="39" w:unhideWhenUsed="1"/>
+    <w:lsdException w:name="toc 4" w:semiHidden="1" w:uiPriority="39" w:unhideWhenUsed="1"/>
+    <w:lsdException w:name="toc 5" w:semiHidden="1" w:uiPriority="39" w:unhideWhenUsed="1"/>
+    <w:lsdException w:name="toc 6" w:semiHidden="1" w:uiPriority="39" w:unhideWhenUsed="1"/>
+    <w:lsdException w:name="toc 7" w:semiHidden="1" w:uiPriority="39" w:unhideWhenUsed="1"/>
+    <w:lsdException w:name="toc 8" w:semiHidden="1" w:uiPriority="39" w:unhideWhenUsed="1"/>
+    <w:lsdException w:name="toc 9" w:semiHidden="1" w:uiPriority="39" w:unhideWhenUsed="1"/>
+    <w:lsdException w:name="Normal Indent" w:semiHidden="1" w:unhideWhenUsed="1"/>
+    <w:lsdException w:name="footnote text" w:semiHidden="1" w:unhideWhenUsed="1"/>
+    <w:lsdException w:name="annotation text" w:semiHidden="1" w:unhideWhenUsed="1"/>
+    <w:lsdException w:name="header" w:semiHidden="1" w:unhideWhenUsed="1"/>
+    <w:lsdException w:name="footer" w:semiHidden="1" w:unhideWhenUsed="1"/>
+    <w:lsdException w:name="index heading" w:semiHidden="1" w:unhideWhenUsed="1"/>
+    <w:lsdException w:name="caption" w:semiHidden="1" w:uiPriority="35" w:unhideWhenUsed="1" w:qFormat="1"/>
+    <w:lsdException w:name="table of figures" w:semiHidden="1" w:unhideWhenUsed="1"/>
+    <w:lsdException w:name="envelope address" w:semiHidden="1" w:unhideWhenUsed="1"/>
+    <w:lsdException w:name="envelope return" w:semiHidden="1" w:unhideWhenUsed="1"/>
+    <w:lsdException w:name="footnote reference" w:semiHidden="1" w:unhideWhenUsed="1"/>
+    <w:lsdException w:name="annotation reference" w:semiHidden="1" w:unhideWhenUsed="1"/>
+    <w:lsdException w:name="line number" w:semiHidden="1" w:unhideWhenUsed="1"/>
+    <w:lsdException w:name="page number" w:semiHidden="1" w:unhideWhenUsed="1"/>
+    <w:lsdException w:name="endnote reference" w:semiHidden="1" w:unhideWhenUsed="1"/>
+    <w:lsdException w:name="endnote text" w:semiHidden="1" w:unhideWhenUsed="1"/>
+    <w:lsdException w:name="table of authorities" w:semiHidden="1" w:unhideWhenUsed="1"/>
+    <w:lsdException w:name="macro" w:semiHidden="1" w:unhideWhenUsed="1"/>
+    <w:lsdException w:name="toa heading" w:semiHidden="1" w:unhideWhenUsed="1"/>
+    <w:lsdException w:name="List" w:semiHidden="1" w:unhideWhenUsed="1"/>
+    <w:lsdException w:name="List Bullet" w:semiHidden="1" w:unhideWhenUsed="1"/>
+    <w:lsdException w:name="List Number" w:semiHidden="1" w:unhideWhenUsed="1"/>
+    <w:lsdException w:name="List 2" w:semiHidden="1" w:unhideWhenUsed="1"/>
+    <w:lsdException w:name="List 3" w:semiHidden="1" w:unhideWhenUsed="1"/>
+    <w:lsdException w:name="List 4" w:semiHidden="1" w:unhideWhenUsed="1"/>
+    <w:lsdException w:name="List 5" w:semiHidden="1" w:unhideWhenUsed="1"/>
+    <w:lsdException w:name="List Bullet 2" w:semiHidden="1" w:unhideWhenUsed="1"/>
+    <w:lsdException w:name="List Bullet 3" w:semiHidden="1" w:unhideWhenUsed="1"/>
+    <w:lsdException w:name="List Bullet 4" w:semiHidden="1" w:unhideWhenUsed="1"/>
+    <w:lsdException w:name="List Bullet 5" w:semiHidden="1" w:unhideWhenUsed="1"/>
+    <w:lsdException w:name="List Number 2" w:semiHidden="1" w:unhideWhenUsed="1"/>
+    <w:lsdException w:name="List Number 3" w:semiHidden="1" w:unhideWhenUsed="1"/>
+    <w:lsdException w:name="List Number 4" w:semiHidden="1" w:unhideWhenUsed="1"/>
+    <w:lsdException w:name="List Number 5" w:semiHidden="1" w:unhideWhenUsed="1"/>
+    <w:lsdException w:name="Title" w:uiPriority="10" w:qFormat="1"/>
+    <w:lsdException w:name="Closing" w:semiHidden="1" w:unhideWhenUsed="1"/>
+    <w:lsdException w:name="Signature" w:semiHidden="1" w:unhideWhenUsed="1"/>
+    <w:lsdException w:name="Default Paragraph Font" w:semiHidden="1" w:uiPriority="1" w:unhideWhenUsed="1"/>
+    <w:lsdException w:name="Body Text" w:semiHidden="1" w:unhideWhenUsed="1"/>
+    <w:lsdException w:name="Body Text Indent" w:semiHidden="1" w:unhideWhenUsed="1"/>
+    <w:lsdException w:name="List Continue" w:semiHidden="1" w:unhideWhenUsed="1"/>
+    <w:lsdException w:name="List Continue 2" w:semiHidden="1" w:unhideWhenUsed="1"/>
+    <w:lsdException w:name="List Continue 3" w:semiHidden="1" w:unhideWhenUsed="1"/>
+    <w:lsdException w:name="List Continue 4" w:semiHidden="1" w:unhideWhenUsed="1"/>
+    <w:lsdException w:name="List Continue 5" w:semiHidden="1" w:unhideWhenUsed="1"/>
+    <w:lsdException w:name="Message Header" w:semiHidden="1" w:unhideWhenUsed="1"/>
+    <w:lsdException w:name="Subtitle" w:uiPriority="11" w:qFormat="1"/>
+    <w:lsdException w:name="Salutation" w:semiHidden="1" w:unhideWhenUsed="1"/>
+    <w:lsdException w:name="Date" w:semiHidden="1" w:unhideWhenUsed="1"/>
+    <w:lsdException w:name="Body Text First Indent" w:semiHidden="1" w:unhideWhenUsed="1"/>
+    <w:lsdException w:name="Body Text First Indent 2" w:semiHidden="1" w:unhideWhenUsed="1"/>
+    <w:lsdException w:name="Note Heading" w:semiHidden="1" w:unhideWhenUsed="1"/>
+    <w:lsdException w:name="Body Text 2" w:semiHidden="1" w:unhideWhenUsed="1"/>
+    <w:lsdException w:name="Body Text 3" w:semiHidden="1" w:unhideWhenUsed="1"/>
+    <w:lsdException w:name="Body Text Indent 2" w:semiHidden="1" w:unhideWhenUsed="1"/>
+    <w:lsdException w:name="Body Text Indent 3" w:semiHidden="1" w:unhideWhenUsed="1"/>
+    <w:lsdException w:name="Block Text" w:semiHidden="1" w:unhideWhenUsed="1"/>
+    <w:lsdException w:name="Hyperlink" w:semiHidden="1" w:unhideWhenUsed="1"/>
+    <w:lsdException w:name="FollowedHyperlink" w:semiHidden="1" w:unhideWhenUsed="1"/>
+    <w:lsdException w:name="Strong" w:uiPriority="22" w:qFormat="1"/>
+    <w:lsdException w:name="Emphasis" w:uiPriority="20" w:qFormat="1"/>
+    <w:lsdException w:name="Document Map" w:semiHidden="1" w:unhideWhenUsed="1"/>
+    <w:lsdException w:name="Plain Text" w:semiHidden="1" w:unhideWhenUsed="1"/>
+    <w:lsdException w:name="E-mail Signature" w:semiHidden="1" w:unhideWhenUsed="1"/>
+    <w:lsdException w:name="HTML Top of Form" w:semiHidden="1" w:unhideWhenUsed="1"/>
+    <w:lsdException w:name="HTML Bottom of Form" w:semiHidden="1" w:unhideWhenUsed="1"/>
+    <w:lsdException w:name="Normal (Web)" w:semiHidden="1" w:unhideWhenUsed="1"/>
+    <w:lsdException w:name="HTML Acronym" w:semiHidden="1" w:unhideWhenUsed="1"/>
+    <w:lsdException w:name="HTML Address" w:semiHidden="1" w:unhideWhenUsed="1"/>
+    <w:lsdException w:name="HTML Cite" w:semiHidden="1" w:unhideWhenUsed="1"/>
+    <w:lsdException w:name="HTML Code" w:semiHidden="1" w:unhideWhenUsed="1"/>
+    <w:lsdException w:name="HTML Definition" w:semiHidden="1" w:unhideWhenUsed="1"/>
+    <w:lsdException w:name="HTML Keyboard" w:semiHidden="1" w:unhideWhenUsed="1"/>
+    <w:lsdException w:name="HTML Preformatted" w:semiHidden="1" w:unhideWhenUsed="1"/>
+    <w:lsdException w:name="HTML Sample" w:semiHidden="1" w:unhideWhenUsed="1"/>
+    <w:lsdException w:name="HTML Typewriter" w:semiHidden="1" w:unhideWhenUsed="1"/>
+    <w:lsdException w:name="HTML Variable" w:semiHidden="1" w:unhideWhenUsed="1"/>
+    <w:lsdException w:name="Normal Table" w:semiHidden="1" w:unhideWhenUsed="1"/>
+    <w:lsdException w:name="annotation subject" w:semiHidden="1" w:unhideWhenUsed="1"/>
+    <w:lsdException w:name="No List" w:semiHidden="1" w:unhideWhenUsed="1"/>
+    <w:lsdException w:name="Outline List 1" w:semiHidden="1" w:unhideWhenUsed="1"/>
+    <w:lsdException w:name="Outline List 2" w:semiHidden="1" w:unhideWhenUsed="1"/>
+    <w:lsdException w:name="Outline List 3" w:semiHidden="1" w:unhideWhenUsed="1"/>
+    <w:lsdException w:name="Table Simple 1" w:semiHidden="1" w:unhideWhenUsed="1"/>
+    <w:lsdException w:name="Table Simple 2" w:semiHidden="1" w:unhideWhenUsed="1"/>
+    <w:lsdException w:name="Table Simple 3" w:semiHidden="1" w:unhideWhenUsed="1"/>
+    <w:lsdException w:name="Table Classic 1" w:semiHidden="1" w:unhideWhenUsed="1"/>
+    <w:lsdException w:name="Table Classic 2" w:semiHidden="1" w:unhideWhenUsed="1"/>
+    <w:lsdException w:name="Table Classic 3" w:semiHidden="1" w:unhideWhenUsed="1"/>
+    <w:lsdException w:name="Table Classic 4" w:semiHidden="1" w:unhideWhenUsed="1"/>
+    <w:lsdException w:name="Table Colorful 1" w:semiHidden="1" w:unhideWhenUsed="1"/>
+    <w:lsdException w:name="Table Colorful 2" w:semiHidden="1" w:unhideWhenUsed="1"/>
+    <w:lsdException w:name="Table Colorful 3" w:semiHidden="1" w:unhideWhenUsed="1"/>
+    <w:lsdException w:name="Table Columns 1" w:semiHidden="1" w:unhideWhenUsed="1"/>
+    <w:lsdException w:name="Table Columns 2" w:semiHidden="1" w:unhideWhenUsed="1"/>
+    <w:lsdException w:name="Table Columns 3" w:semiHidden="1" w:unhideWhenUsed="1"/>
+    <w:lsdException w:name="Table Columns 4" w:semiHidden="1" w:unhideWhenUsed="1"/>
+    <w:lsdException w:name="Table Columns 5" w:semiHidden="1" w:unhideWhenUsed="1"/>
+    <w:lsdException w:name="Table Grid 1" w:semiHidden="1" w:unhideWhenUsed="1"/>
+    <w:lsdException w:name="Table Grid 2" w:semiHidden="1" w:unhideWhenUsed="1"/>
+    <w:lsdException w:name="Table Grid 3" w:semiHidden="1" w:unhideWhenUsed="1"/>
+    <w:lsdException w:name="Table Grid 4" w:semiHidden="1" w:unhideWhenUsed="1"/>
+    <w:lsdException w:name="Table Grid 5" w:semiHidden="1" w:unhideWhenUsed="1"/>
+    <w:lsdException w:name="Table Grid 6" w:semiHidden="1" w:unhideWhenUsed="1"/>
+    <w:lsdException w:name="Table Grid 7" w:semiHidden="1" w:unhideWhenUsed="1"/>
+    <w:lsdException w:name="Table Grid 8" w:semiHidden="1" w:unhideWhenUsed="1"/>
+    <w:lsdException w:name="Table List 1" w:semiHidden="1" w:unhideWhenUsed="1"/>
+    <w:lsdException w:name="Table List 2" w:semiHidden="1" w:unhideWhenUsed="1"/>
+    <w:lsdException w:name="Table List 3" w:semiHidden="1" w:unhideWhenUsed="1"/>
+    <w:lsdException w:name="Table List 4" w:semiHidden="1" w:unhideWhenUsed="1"/>
+    <w:lsdException w:name="Table List 5" w:semiHidden="1" w:unhideWhenUsed="1"/>
+    <w:lsdException w:name="Table List 6" w:semiHidden="1" w:unhideWhenUsed="1"/>
+    <w:lsdException w:name="Table List 7" w:semiHidden="1" w:unhideWhenUsed="1"/>
+    <w:lsdException w:name="Table List 8" w:semiHidden="1" w:unhideWhenUsed="1"/>
+    <w:lsdException w:name="Table 3D effects 1" w:semiHidden="1" w:unhideWhenUsed="1"/>
+    <w:lsdException w:name="Table 3D effects 2" w:semiHidden="1" w:unhideWhenUsed="1"/>
+    <w:lsdException w:name="Table 3D effects 3" w:semiHidden="1" w:unhideWhenUsed="1"/>
+    <w:lsdException w:name="Table Contemporary" w:semiHidden="1" w:unhideWhenUsed="1"/>
+    <w:lsdException w:name="Table Elegant" w:semiHidden="1" w:unhideWhenUsed="1"/>
+    <w:lsdException w:name="Table Professional" w:semiHidden="1" w:unhideWhenUsed="1"/>
+    <w:lsdException w:name="Table Subtle 1" w:semiHidden="1" w:unhideWhenUsed="1"/>
+    <w:lsdException w:name="Table Subtle 2" w:semiHidden="1" w:unhideWhenUsed="1"/>
+    <w:lsdException w:name="Table Web 1" w:semiHidden="1" w:unhideWhenUsed="1"/>
+    <w:lsdException w:name="Table Web 2" w:semiHidden="1" w:unhideWhenUsed="1"/>
+    <w:lsdException w:name="Table Web 3" w:semiHidden="1" w:unhideWhenUsed="1"/>
+    <w:lsdException w:name="Balloon Text" w:semiHidden="1" w:unhideWhenUsed="1"/>
+    <w:lsdException w:name="Table Grid" w:uiPriority="39"/>
+    <w:lsdException w:name="Table Theme" w:semiHidden="1" w:unhideWhenUsed="1"/>
+    <w:lsdException w:name="Placeholder Text" w:semiHidden="1"/>
+    <w:lsdException w:name="No Spacing" w:uiPriority="1" w:qFormat="1"/>
+    <w:lsdException w:name="Light Shading" w:uiPriority="60"/>
+    <w:lsdException w:name="Light List" w:uiPriority="61"/>
+    <w:lsdException w:name="Light Grid" w:uiPriority="62"/>
+    <w:lsdException w:name="Medium Shading 1" w:uiPriority="63"/>
+    <w:lsdException w:name="Medium Shading 2" w:uiPriority="64"/>
+    <w:lsdException w:name="Medium List 1" w:uiPriority="65"/>
+    <w:lsdException w:name="Medium List 2" w:uiPriority="66"/>
+    <w:lsdException w:name="Medium Grid 1" w:uiPriority="67"/>
+    <w:lsdException w:name="Medium Grid 2" w:uiPriority="68"/>
+    <w:lsdException w:name="Medium Grid 3" w:uiPriority="69"/>
+    <w:lsdException w:name="Dark List" w:uiPriority="70"/>
+    <w:lsdException w:name="Colorful Shading" w:uiPriority="71"/>
+    <w:lsdException w:name="Colorful List" w:uiPriority="72"/>
+    <w:lsdException w:name="Colorful Grid" w:uiPriority="73"/>
+    <w:lsdException w:name="Light Shading Accent 1" w:uiPriority="60"/>
+    <w:lsdException w:name="Light List Accent 1" w:uiPriority="61"/>
+    <w:lsdException w:name="Light Grid Accent 1" w:uiPriority="62"/>
+    <w:lsdException w:name="Medium Shading 1 Accent 1" w:uiPriority="63"/>
+    <w:lsdException w:name="Medium Shading 2 Accent 1" w:uiPriority="64"/>
+    <w:lsdException w:name="Medium List 1 Accent 1" w:uiPriority="65"/>
+    <w:lsdException w:name="Revision" w:semiHidden="1"/>
+    <w:lsdException w:name="List Paragraph" w:uiPriority="34" w:qFormat="1"/>
+    <w:lsdException w:name="Quote" w:uiPriority="29" w:qFormat="1"/>
+    <w:lsdException w:name="Intense Quote" w:uiPriority="30" w:qFormat="1"/>
+    <w:lsdException w:name="Medium List 2 Accent 1" w:uiPriority="66"/>
+    <w:lsdException w:name="Medium Grid 1 Accent 1" w:uiPriority="67"/>
+    <w:lsdException w:name="Medium Grid 2 Accent 1" w:uiPriority="68"/>
+    <w:lsdException w:name="Medium Grid 3 Accent 1" w:uiPriority="69"/>
+    <w:lsdException w:name="Dark List Accent 1" w:uiPriority="70"/>
+    <w:lsdException w:name="Colorful Shading Accent 1" w:uiPriority="71"/>
+    <w:lsdException w:name="Colorful List Accent 1" w:uiPriority="72"/>
+    <w:lsdException w:name="Colorful Grid Accent 1" w:uiPriority="73"/>
+    <w:lsdException w:name="Light Shading Accent 2" w:uiPriority="60"/>
+    <w:lsdException w:name="Light List Accent 2" w:uiPriority="61"/>
+    <w:lsdException w:name="Light Grid Accent 2" w:uiPriority="62"/>
+    <w:lsdException w:name="Medium Shading 1 Accent 2" w:uiPriority="63"/>
+    <w:lsdException w:name="Medium Shading 2 Accent 2" w:uiPriority="64"/>
+    <w:lsdException w:name="Medium List 1 Accent 2" w:uiPriority="65"/>
+    <w:lsdException w:name="Medium List 2 Accent 2" w:uiPriority="66"/>
+    <w:lsdException w:name="Medium Grid 1 Accent 2" w:uiPriority="67"/>
+    <w:lsdException w:name="Medium Grid 2 Accent 2" w:uiPriority="68"/>
+    <w:lsdException w:name="Medium Grid 3 Accent 2" w:uiPriority="69"/>
+    <w:lsdException w:name="Dark List Accent 2" w:uiPriority="70"/>
+    <w:lsdException w:name="Colorful Shading Accent 2" w:uiPriority="71"/>
+    <w:lsdException w:name="Colorful List Accent 2" w:uiPriority="72"/>
+    <w:lsdException w:name="Colorful Grid Accent 2" w:uiPriority="73"/>
+    <w:lsdException w:name="Light Shading Accent 3" w:uiPriority="60"/>
+    <w:lsdException w:name="Light List Accent 3" w:uiPriority="61"/>
+    <w:lsdException w:name="Light Grid Accent 3" w:uiPriority="62"/>
+    <w:lsdException w:name="Medium Shading 1 Accent 3" w:uiPriority="63"/>
+    <w:lsdException w:name="Medium Shading 2 Accent 3" w:uiPriority="64"/>
+    <w:lsdException w:name="Medium List 1 Accent 3" w:uiPriority="65"/>
+    <w:lsdException w:name="Medium List 2 Accent 3" w:uiPriority="66"/>
+    <w:lsdException w:name="Medium Grid 1 Accent 3" w:uiPriority="67"/>
+    <w:lsdException w:name="Medium Grid 2 Accent 3" w:uiPriority="68"/>
+    <w:lsdException w:name="Medium Grid 3 Accent 3" w:uiPriority="69"/>
+    <w:lsdException w:name="Dark List Accent 3" w:uiPriority="70"/>
+    <w:lsdException w:name="Colorful Shading Accent 3" w:uiPriority="71"/>
+    <w:lsdException w:name="Colorful List Accent 3" w:uiPriority="72"/>
+    <w:lsdException w:name="Colorful Grid Accent 3" w:uiPriority="73"/>
+    <w:lsdException w:name="Light Shading Accent 4" w:uiPriority="60"/>
+    <w:lsdException w:name="Light List Accent 4" w:uiPriority="61"/>
+    <w:lsdException w:name="Light Grid Accent 4" w:uiPriority="62"/>
+    <w:lsdException w:name="Medium Shading 1 Accent 4" w:uiPriority="63"/>
+    <w:lsdException w:name="Medium Shading 2 Accent 4" w:uiPriority="64"/>
+    <w:lsdException w:name="Medium List 1 Accent 4" w:uiPriority="65"/>
+    <w:lsdException w:name="Medium List 2 Accent 4" w:uiPriority="66"/>
+    <w:lsdException w:name="Medium Grid 1 Accent 4" w:uiPriority="67"/>
+    <w:lsdException w:name="Medium Grid 2 Accent 4" w:uiPriority="68"/>
+    <w:lsdException w:name="Medium Grid 3 Accent 4" w:uiPriority="69"/>
+    <w:lsdException w:name="Dark List Accent 4" w:uiPriority="70"/>
+    <w:lsdException w:name="Colorful Shading Accent 4" w:uiPriority="71"/>
+    <w:lsdException w:name="Colorful List Accent 4" w:uiPriority="72"/>
+    <w:lsdException w:name="Colorful Grid Accent 4" w:uiPriority="73"/>
+    <w:lsdException w:name="Light Shading Accent 5" w:uiPriority="60"/>
+    <w:lsdException w:name="Light List Accent 5" w:uiPriority="61"/>
+    <w:lsdException w:name="Light Grid Accent 5" w:uiPriority="62"/>
+    <w:lsdException w:name="Medium Shading 1 Accent 5" w:uiPriority="63"/>
+    <w:lsdException w:name="Medium Shading 2 Accent 5" w:uiPriority="64"/>
+    <w:lsdException w:name="Medium List 1 Accent 5" w:uiPriority="65"/>
+    <w:lsdException w:name="Medium List 2 Accent 5" w:uiPriority="66"/>
+    <w:lsdException w:name="Medium Grid 1 Accent 5" w:uiPriority="67"/>
+    <w:lsdException w:name="Medium Grid 2 Accent 5" w:uiPriority="68"/>
+    <w:lsdException w:name="Medium Grid 3 Accent 5" w:uiPriority="69"/>
+    <w:lsdException w:name="Dark List Accent 5" w:uiPriority="70"/>
+    <w:lsdException w:name="Colorful Shading Accent 5" w:uiPriority="71"/>
+    <w:lsdException w:name="Colorful List Accent 5" w:uiPriority="72"/>
+    <w:lsdException w:name="Colorful Grid Accent 5" w:uiPriority="73"/>
+    <w:lsdException w:name="Light Shading Accent 6" w:uiPriority="60"/>
+    <w:lsdException w:name="Light List Accent 6" w:uiPriority="61"/>
+    <w:lsdException w:name="Light Grid Accent 6" w:uiPriority="62"/>
+    <w:lsdException w:name="Medium Shading 1 Accent 6" w:uiPriority="63"/>
+    <w:lsdException w:name="Medium Shading 2 Accent 6" w:uiPriority="64"/>
+    <w:lsdException w:name="Medium List 1 Accent 6" w:uiPriority="65"/>
+    <w:lsdException w:name="Medium List 2 Accent 6" w:uiPriority="66"/>
+    <w:lsdException w:name="Medium Grid 1 Accent 6" w:uiPriority="67"/>
+    <w:lsdException w:name="Medium Grid 2 Accent 6" w:uiPriority="68"/>
+    <w:lsdException w:name="Medium Grid 3 Accent 6" w:uiPriority="69"/>
+    <w:lsdException w:name="Dark List Accent 6" w:uiPriority="70"/>
+    <w:lsdException w:name="Colorful Shading Accent 6" w:uiPriority="71"/>
+    <w:lsdException w:name="Colorful List Accent 6" w:uiPriority="72"/>
+    <w:lsdException w:name="Colorful Grid Accent 6" w:uiPriority="73"/>
+    <w:lsdException w:name="Subtle Emphasis" w:uiPriority="19" w:qFormat="1"/>
+    <w:lsdException w:name="Intense Emphasis" w:uiPriority="21" w:qFormat="1"/>
+    <w:lsdException w:name="Subtle Reference" w:uiPriority="31" w:qFormat="1"/>
+    <w:lsdException w:name="Intense Reference" w:uiPriority="32" w:qFormat="1"/>
+    <w:lsdException w:name="Book Title" w:uiPriority="33" w:qFormat="1"/>
+    <w:lsdException w:name="Bibliography" w:semiHidden="1" w:uiPriority="37" w:unhideWhenUsed="1"/>
+    <w:lsdException w:name="TOC Heading" w:semiHidden="1" w:uiPriority="39" w:unhideWhenUsed="1" w:qFormat="1"/>
+    <w:lsdException w:name="Plain Table 1" w:uiPriority="41"/>
+    <w:lsdException w:name="Plain Table 2" w:uiPriority="42"/>
+    <w:lsdException w:name="Plain Table 3" w:uiPriority="43"/>
+    <w:lsdException w:name="Plain Table 4" w:uiPriority="44"/>
+    <w:lsdException w:name="Plain Table 5" w:uiPriority="45"/>
+    <w:lsdException w:name="Grid Table Light" w:uiPriority="40"/>
+    <w:lsdException w:name="Grid Table 1 Light" w:uiPriority="46"/>
+    <w:lsdException w:name="Grid Table 2" w:uiPriority="47"/>
+    <w:lsdException w:name="Grid Table 3" w:uiPriority="48"/>
+    <w:lsdException w:name="Grid Table 4" w:uiPriority="49"/>
+    <w:lsdException w:name="Grid Table 5 Dark" w:uiPriority="50"/>
+    <w:lsdException w:name="Grid Table 6 Colorful" w:uiPriority="51"/>
+    <w:lsdException w:name="Grid Table 7 Colorful" w:uiPriority="52"/>
+    <w:lsdException w:name="Grid Table 1 Light Accent 1" w:uiPriority="46"/>
+    <w:lsdException w:name="Grid Table 2 Accent 1" w:uiPriority="47"/>
+    <w:lsdException w:name="Grid Table 3 Accent 1" w:uiPriority="48"/>
+    <w:lsdException w:name="Grid Table 4 Accent 1" w:uiPriority="49"/>
+    <w:lsdException w:name="Grid Table 5 Dark Accent 1" w:uiPriority="50"/>
+    <w:lsdException w:name="Grid Table 6 Colorful Accent 1" w:uiPriority="51"/>
+    <w:lsdException w:name="Grid Table 7 Colorful Accent 1" w:uiPriority="52"/>
+    <w:lsdException w:name="Grid Table 1 Light Accent 2" w:uiPriority="46"/>
+    <w:lsdException w:name="Grid Table 2 Accent 2" w:uiPriority="47"/>
+    <w:lsdException w:name="Grid Table 3 Accent 2" w:uiPriority="48"/>
+    <w:lsdException w:name="Grid Table 4 Accent 2" w:uiPriority="49"/>
+    <w:lsdException w:name="Grid Table 5 Dark Accent 2" w:uiPriority="50"/>
+    <w:lsdException w:name="Grid Table 6 Colorful Accent 2" w:uiPriority="51"/>
+    <w:lsdException w:name="Grid Table 7 Colorful Accent 2" w:uiPriority="52"/>
+    <w:lsdException w:name="Grid Table 1 Light Accent 3" w:uiPriority="46"/>
+    <w:lsdException w:name="Grid Table 2 Accent 3" w:uiPriority="47"/>
+    <w:lsdException w:name="Grid Table 3 Accent 3" w:uiPriority="48"/>
+    <w:lsdException w:name="Grid Table 4 Accent 3" w:uiPriority="49"/>
+    <w:lsdException w:name="Grid Table 5 Dark Accent 3" w:uiPriority="50"/>
+    <w:lsdException w:name="Grid Table 6 Colorful Accent 3" w:uiPriority="51"/>
+    <w:lsdException w:name="Grid Table 7 Colorful Accent 3" w:uiPriority="52"/>
+    <w:lsdException w:name="Grid Table 1 Light Accent 4" w:uiPriority="46"/>
+    <w:lsdException w:name="Grid Table 2 Accent 4" w:uiPriority="47"/>
+    <w:lsdException w:name="Grid Table 3 Accent 4" w:uiPriority="48"/>
+    <w:lsdException w:name="Grid Table 4 Accent 4" w:uiPriority="49"/>
+    <w:lsdException w:name="Grid Table 5 Dark Accent 4" w:uiPriority="50"/>
+    <w:lsdException w:name="Grid Table 6 Colorful Accent 4" w:uiPriority="51"/>
+    <w:lsdException w:name="Grid Table 7 Colorful Accent 4" w:uiPriority="52"/>
+    <w:lsdException w:name="Grid Table 1 Light Accent 5" w:uiPriority="46"/>
+    <w:lsdException w:name="Grid Table 2 Accent 5" w:uiPriority="47"/>
+    <w:lsdException w:name="Grid Table 3 Accent 5" w:uiPriority="48"/>
+    <w:lsdException w:name="Grid Table 4 Accent 5" w:uiPriority="49"/>
+    <w:lsdException w:name="Grid Table 5 Dark Accent 5" w:uiPriority="50"/>
+    <w:lsdException w:name="Grid Table 6 Colorful Accent 5" w:uiPriority="51"/>
+    <w:lsdException w:name="Grid Table 7 Colorful Accent 5" w:uiPriority="52"/>
+    <w:lsdException w:name="Grid Table 1 Light Accent 6" w:uiPriority="46"/>
+    <w:lsdException w:name="Grid Table 2 Accent 6" w:uiPriority="47"/>
+    <w:lsdException w:name="Grid Table 3 Accent 6" w:uiPriority="48"/>
+    <w:lsdException w:name="Grid Table 4 Accent 6" w:uiPriority="49"/>
+    <w:lsdException w:name="Grid Table 5 Dark Accent 6" w:uiPriority="50"/>
+    <w:lsdException w:name="Grid Table 6 Colorful Accent 6" w:uiPriority="51"/>
+    <w:lsdException w:name="Grid Table 7 Colorful Accent 6" w:uiPriority="52"/>
+    <w:lsdException w:name="List Table 1 Light" w:uiPriority="46"/>
+    <w:lsdException w:name="List Table 2" w:uiPriority="47"/>
+    <w:lsdException w:name="List Table 3" w:uiPriority="48"/>
+    <w:lsdException w:name="List Table 4" w:uiPriority="49"/>
+    <w:lsdException w:name="List Table 5 Dark" w:uiPriority="50"/>
+    <w:lsdException w:name="List Table 6 Colorful" w:uiPriority="51"/>
+    <w:lsdException w:name="List Table 7 Colorful" w:uiPriority="52"/>
+    <w:lsdException w:name="List Table 1 Light Accent 1" w:uiPriority="46"/>
+    <w:lsdException w:name="List Table 2 Accent 1" w:uiPriority="47"/>
+    <w:lsdException w:name="List Table 3 Accent 1" w:uiPriority="48"/>
+    <w:lsdException w:name="List Table 4 Accent 1" w:uiPriority="49"/>
+    <w:lsdException w:name="List Table 5 Dark Accent 1" w:uiPriority="50"/>
+    <w:lsdException w:name="List Table 6 Colorful Accent 1" w:uiPriority="51"/>
+    <w:lsdException w:name="List Table 7 Colorful Accent 1" w:uiPriority="52"/>
+    <w:lsdException w:name="List Table 1 Light Accent 2" w:uiPriority="46"/>
+    <w:lsdException w:name="List Table 2 Accent 2" w:uiPriority="47"/>
+    <w:lsdException w:name="List Table 3 Accent 2" w:uiPriority="48"/>
+    <w:lsdException w:name="List Table 4 Accent 2" w:uiPriority="49"/>
+    <w:lsdException w:name="List Table 5 Dark Accent 2" w:uiPriority="50"/>
+    <w:lsdException w:name="List Table 6 Colorful Accent 2" w:uiPriority="51"/>
+    <w:lsdException w:name="List Table 7 Colorful Accent 2" w:uiPriority="52"/>
+    <w:lsdException w:name="List Table 1 Light Accent 3" w:uiPriority="46"/>
+    <w:lsdException w:name="List Table 2 Accent 3" w:uiPriority="47"/>
+    <w:lsdException w:name="List Table 3 Accent 3" w:uiPriority="48"/>
+    <w:lsdException w:name="List Table 4 Accent 3" w:uiPriority="49"/>
+    <w:lsdException w:name="List Table 5 Dark Accent 3" w:uiPriority="50"/>
+    <w:lsdException w:name="List Table 6 Colorful Accent 3" w:uiPriority="51"/>
+    <w:lsdException w:name="List Table 7 Colorful Accent 3" w:uiPriority="52"/>
+    <w:lsdException w:name="List Table 1 Light Accent 4" w:uiPriority="46"/>
+    <w:lsdException w:name="List Table 2 Accent 4" w:uiPriority="47"/>
+    <w:lsdException w:name="List Table 3 Accent 4" w:uiPriority="48"/>
+    <w:lsdException w:name="List Table 4 Accent 4" w:uiPriority="49"/>
+    <w:lsdException w:name="List Table 5 Dark Accent 4" w:uiPriority="50"/>
+    <w:lsdException w:name="List Table 6 Colorful Accent 4" w:uiPriority="51"/>
+    <w:lsdException w:name="List Table 7 Colorful Accent 4" w:uiPriority="52"/>
+    <w:lsdException w:name="List Table 1 Light Accent 5" w:uiPriority="46"/>
+    <w:lsdException w:name="List Table 2 Accent 5" w:uiPriority="47"/>
+    <w:lsdException w:name="List Table 3 Accent 5" w:uiPriority="48"/>
+    <w:lsdException w:name="List Table 4 Accent 5" w:uiPriority="49"/>
+    <w:lsdException w:name="List Table 5 Dark Accent 5" w:uiPriority="50"/>
+    <w:lsdException w:name="List Table 6 Colorful Accent 5" w:uiPriority="51"/>
+    <w:lsdException w:name="List Table 7 Colorful Accent 5" w:uiPriority="52"/>
+    <w:lsdException w:name="List Table 1 Light Accent 6" w:uiPriority="46"/>
+    <w:lsdException w:name="List Table 2 Accent 6" w:uiPriority="47"/>
+    <w:lsdException w:name="List Table 3 Accent 6" w:uiPriority="48"/>
+    <w:lsdException w:name="List Table 4 Accent 6" w:uiPriority="49"/>
+    <w:lsdException w:name="List Table 5 Dark Accent 6" w:uiPriority="50"/>
+    <w:lsdException w:name="List Table 6 Colorful Accent 6" w:uiPriority="51"/>
+    <w:lsdException w:name="List Table 7 Colorful Accent 6" w:uiPriority="52"/>
+    <w:lsdException w:name="Mention" w:semiHidden="1" w:unhideWhenUsed="1"/>
+    <w:lsdException w:name="Smart Hyperlink" w:semiHidden="1" w:unhideWhenUsed="1"/>
+    <w:lsdException w:name="Hashtag" w:semiHidden="1" w:unhideWhenUsed="1"/>
+    <w:lsdException w:name="Unresolved Mention" w:semiHidden="1" w:unhideWhenUsed="1"/>
+    <w:lsdException w:name="Smart Link" w:semiHidden="1" w:unhideWhenUsed="1"/>
   </w:latentStyles>
   <w:style w:type="paragraph" w:default="1" w:styleId="Normal">
     <w:name w:val="Normal"/>
@@ -1741,7 +2682,6 @@
     <w:uiPriority w:val="99"/>
     <w:semiHidden/>
     <w:unhideWhenUsed/>
-    <w:qFormat/>
     <w:tblPr>
       <w:tblInd w:w="0" w:type="dxa"/>
       <w:tblCellMar>
@@ -1776,7 +2716,6 @@
       <w:spacing w:after="0" w:line="240" w:lineRule="auto"/>
     </w:pPr>
     <w:tblPr>
-      <w:tblInd w:w="0" w:type="dxa"/>
       <w:tblBorders>
         <w:top w:val="single" w:sz="4" w:space="0" w:color="auto"/>
         <w:left w:val="single" w:sz="4" w:space="0" w:color="auto"/>
@@ -1785,12 +2724,6 @@
         <w:insideH w:val="single" w:sz="4" w:space="0" w:color="auto"/>
         <w:insideV w:val="single" w:sz="4" w:space="0" w:color="auto"/>
       </w:tblBorders>
-      <w:tblCellMar>
-        <w:top w:w="0" w:type="dxa"/>
-        <w:left w:w="108" w:type="dxa"/>
-        <w:bottom w:w="0" w:type="dxa"/>
-        <w:right w:w="108" w:type="dxa"/>
-      </w:tblCellMar>
     </w:tblPr>
   </w:style>
   <w:style w:type="paragraph" w:customStyle="1" w:styleId="Maptitle">
@@ -2116,7 +3049,7 @@
   <a:extraClrSchemeLst/>
   <a:extLst>
     <a:ext uri="{05A4C25C-085E-4340-85A3-A5531E510DB2}">
-      <thm15:themeFamily xmlns:thm15="http://schemas.microsoft.com/office/thememl/2012/main" xmlns="" name="Office Theme" id="{62F939B6-93AF-4DB8-9C6B-D6C7DFDC589F}" vid="{4A3C46E8-61CC-4603-A589-7422A47A8E4A}"/>
+      <thm15:themeFamily xmlns:thm15="http://schemas.microsoft.com/office/thememl/2012/main" name="Office Theme" id="{62F939B6-93AF-4DB8-9C6B-D6C7DFDC589F}" vid="{4A3C46E8-61CC-4603-A589-7422A47A8E4A}"/>
     </a:ext>
   </a:extLst>
 </a:theme>

</xml_diff>